<commit_message>
Add downloadable master Word (.docx) report and UI download integration
</commit_message>
<xml_diff>
--- a/reports/FFM_CIE2_Loan_Approval_Prediction_Report.docx
+++ b/reports/FFM_CIE2_Loan_Approval_Prediction_Report.docx
@@ -4,13 +4,23 @@
   <w:body>
     <w:p>
       <w:pPr>
+        <w:spacing w:after="40"/>
         <w:jc w:val="center"/>
       </w:pPr>
       <w:r>
         <w:rPr>
           <w:b/>
+          <w:color w:val="64748B"/>
+          <w:sz w:val="22"/>
+        </w:rPr>
+        <w:t>ACADEMIC PROJECT REPORT (CIE 2)</w:t>
+        <w:br/>
+      </w:r>
+      <w:r>
+        <w:rPr>
+          <w:b/>
           <w:color w:val="1E3A8A"/>
-          <w:sz w:val="32"/>
+          <w:sz w:val="36"/>
         </w:rPr>
         <w:t>FINANCIAL DATA ANALYSIS AND MANAGEMENT SYSTEM USING MACHINE LEARNING</w:t>
         <w:br/>
@@ -18,23 +28,10 @@
       <w:r>
         <w:rPr>
           <w:b/>
-          <w:color w:val="4B5563"/>
+          <w:color w:val="475569"/>
           <w:sz w:val="26"/>
         </w:rPr>
-        <w:t>Domain: Loan Approval Prediction &amp; Automated Credit Underwriting</w:t>
-        <w:br/>
-      </w:r>
-    </w:p>
-    <w:p>
-      <w:pPr>
-        <w:jc w:val="center"/>
-      </w:pPr>
-      <w:r>
-        <w:rPr>
-          <w:i/>
-          <w:sz w:val="22"/>
-        </w:rPr>
-        <w:t>CIE 2: Continuous Internal Evaluation | Academic Year 2026-2027</w:t>
+        <w:t>Domain: Automated Loan Approval Prediction &amp; Credit Risk Assessment</w:t>
         <w:br/>
       </w:r>
     </w:p>
@@ -45,19 +42,29 @@
         <w:tblLook w:firstColumn="1" w:firstRow="1" w:lastColumn="0" w:lastRow="0" w:noHBand="0" w:noVBand="1" w:val="04A0"/>
       </w:tblPr>
       <w:tblGrid>
-        <w:gridCol w:w="4680"/>
-        <w:gridCol w:w="4680"/>
+        <w:gridCol w:w="4514"/>
+        <w:gridCol w:w="4514"/>
       </w:tblGrid>
       <w:tr>
         <w:tc>
           <w:tcPr>
-            <w:tcW w:type="dxa" w:w="4680"/>
+            <w:tcW w:type="dxa" w:w="3744"/>
+            <w:tcMar>
+              <w:top w:w="100" w:type="dxa"/>
+              <w:bottom w:w="100" w:type="dxa"/>
+              <w:left w:w="150" w:type="dxa"/>
+              <w:right w:w="150" w:type="dxa"/>
+            </w:tcMar>
             <w:shd w:val="clear" w:color="auto" w:fill="F1F5F9"/>
           </w:tcPr>
           <w:p>
+            <w:pPr>
+              <w:spacing w:after="0"/>
+            </w:pPr>
             <w:r>
               <w:rPr>
                 <w:b/>
+                <w:color w:val="1E3A8A"/>
                 <w:sz w:val="20"/>
               </w:rPr>
               <w:t>Course Name &amp; Code:</w:t>
@@ -66,14 +73,24 @@
         </w:tc>
         <w:tc>
           <w:tcPr>
-            <w:tcW w:type="dxa" w:w="4680"/>
+            <w:tcW w:type="dxa" w:w="5616"/>
+            <w:tcMar>
+              <w:top w:w="100" w:type="dxa"/>
+              <w:bottom w:w="100" w:type="dxa"/>
+              <w:left w:w="150" w:type="dxa"/>
+              <w:right w:w="150" w:type="dxa"/>
+            </w:tcMar>
+            <w:shd w:val="clear" w:color="auto" w:fill="FFFFFF"/>
           </w:tcPr>
           <w:p>
+            <w:pPr>
+              <w:spacing w:after="0"/>
+            </w:pPr>
             <w:r>
               <w:rPr>
                 <w:sz w:val="20"/>
               </w:rPr>
-              <w:t>FFM (Financial Flow of any Project) | Course Code: 2603MD12</w:t>
+              <w:t>Financial Flow of any Project (FFM) | Course Code: 2603MD12</w:t>
             </w:r>
           </w:p>
         </w:tc>
@@ -81,13 +98,23 @@
       <w:tr>
         <w:tc>
           <w:tcPr>
-            <w:tcW w:type="dxa" w:w="4680"/>
+            <w:tcW w:type="dxa" w:w="3744"/>
+            <w:tcMar>
+              <w:top w:w="100" w:type="dxa"/>
+              <w:bottom w:w="100" w:type="dxa"/>
+              <w:left w:w="150" w:type="dxa"/>
+              <w:right w:w="150" w:type="dxa"/>
+            </w:tcMar>
             <w:shd w:val="clear" w:color="auto" w:fill="F1F5F9"/>
           </w:tcPr>
           <w:p>
+            <w:pPr>
+              <w:spacing w:after="0"/>
+            </w:pPr>
             <w:r>
               <w:rPr>
                 <w:b/>
+                <w:color w:val="1E3A8A"/>
                 <w:sz w:val="20"/>
               </w:rPr>
               <w:t>Class &amp; Semester:</w:t>
@@ -96,9 +123,19 @@
         </w:tc>
         <w:tc>
           <w:tcPr>
-            <w:tcW w:type="dxa" w:w="4680"/>
+            <w:tcW w:type="dxa" w:w="5616"/>
+            <w:tcMar>
+              <w:top w:w="100" w:type="dxa"/>
+              <w:bottom w:w="100" w:type="dxa"/>
+              <w:left w:w="150" w:type="dxa"/>
+              <w:right w:w="150" w:type="dxa"/>
+            </w:tcMar>
+            <w:shd w:val="clear" w:color="auto" w:fill="FFFFFF"/>
           </w:tcPr>
           <w:p>
+            <w:pPr>
+              <w:spacing w:after="0"/>
+            </w:pPr>
             <w:r>
               <w:rPr>
                 <w:sz w:val="20"/>
@@ -111,13 +148,73 @@
       <w:tr>
         <w:tc>
           <w:tcPr>
-            <w:tcW w:type="dxa" w:w="4680"/>
+            <w:tcW w:type="dxa" w:w="3744"/>
+            <w:tcMar>
+              <w:top w:w="100" w:type="dxa"/>
+              <w:bottom w:w="100" w:type="dxa"/>
+              <w:left w:w="150" w:type="dxa"/>
+              <w:right w:w="150" w:type="dxa"/>
+            </w:tcMar>
             <w:shd w:val="clear" w:color="auto" w:fill="F1F5F9"/>
           </w:tcPr>
           <w:p>
+            <w:pPr>
+              <w:spacing w:after="0"/>
+            </w:pPr>
             <w:r>
               <w:rPr>
                 <w:b/>
+                <w:color w:val="1E3A8A"/>
+                <w:sz w:val="20"/>
+              </w:rPr>
+              <w:t>Continuous Evaluation:</w:t>
+            </w:r>
+          </w:p>
+        </w:tc>
+        <w:tc>
+          <w:tcPr>
+            <w:tcW w:type="dxa" w:w="5616"/>
+            <w:tcMar>
+              <w:top w:w="100" w:type="dxa"/>
+              <w:bottom w:w="100" w:type="dxa"/>
+              <w:left w:w="150" w:type="dxa"/>
+              <w:right w:w="150" w:type="dxa"/>
+            </w:tcMar>
+            <w:shd w:val="clear" w:color="auto" w:fill="FFFFFF"/>
+          </w:tcPr>
+          <w:p>
+            <w:pPr>
+              <w:spacing w:after="0"/>
+            </w:pPr>
+            <w:r>
+              <w:rPr>
+                <w:sz w:val="20"/>
+              </w:rPr>
+              <w:t>Continuous Internal Evaluation 2 (CIE 2)</w:t>
+            </w:r>
+          </w:p>
+        </w:tc>
+      </w:tr>
+      <w:tr>
+        <w:tc>
+          <w:tcPr>
+            <w:tcW w:type="dxa" w:w="3744"/>
+            <w:tcMar>
+              <w:top w:w="100" w:type="dxa"/>
+              <w:bottom w:w="100" w:type="dxa"/>
+              <w:left w:w="150" w:type="dxa"/>
+              <w:right w:w="150" w:type="dxa"/>
+            </w:tcMar>
+            <w:shd w:val="clear" w:color="auto" w:fill="F1F5F9"/>
+          </w:tcPr>
+          <w:p>
+            <w:pPr>
+              <w:spacing w:after="0"/>
+            </w:pPr>
+            <w:r>
+              <w:rPr>
+                <w:b/>
+                <w:color w:val="1E3A8A"/>
                 <w:sz w:val="20"/>
               </w:rPr>
               <w:t>Selected Emerging Technology:</w:t>
@@ -126,14 +223,24 @@
         </w:tc>
         <w:tc>
           <w:tcPr>
-            <w:tcW w:type="dxa" w:w="4680"/>
+            <w:tcW w:type="dxa" w:w="5616"/>
+            <w:tcMar>
+              <w:top w:w="100" w:type="dxa"/>
+              <w:bottom w:w="100" w:type="dxa"/>
+              <w:left w:w="150" w:type="dxa"/>
+              <w:right w:w="150" w:type="dxa"/>
+            </w:tcMar>
+            <w:shd w:val="clear" w:color="auto" w:fill="FFFFFF"/>
           </w:tcPr>
           <w:p>
+            <w:pPr>
+              <w:spacing w:after="0"/>
+            </w:pPr>
             <w:r>
               <w:rPr>
                 <w:sz w:val="20"/>
               </w:rPr>
-              <w:t>Machine Learning (Supervised Classification &amp; Risk Analytics)</w:t>
+              <w:t>Machine Learning (Supervised Learning &amp; Risk Analytics)</w:t>
             </w:r>
           </w:p>
         </w:tc>
@@ -141,29 +248,49 @@
       <w:tr>
         <w:tc>
           <w:tcPr>
-            <w:tcW w:type="dxa" w:w="4680"/>
+            <w:tcW w:type="dxa" w:w="3744"/>
+            <w:tcMar>
+              <w:top w:w="100" w:type="dxa"/>
+              <w:bottom w:w="100" w:type="dxa"/>
+              <w:left w:w="150" w:type="dxa"/>
+              <w:right w:w="150" w:type="dxa"/>
+            </w:tcMar>
             <w:shd w:val="clear" w:color="auto" w:fill="F1F5F9"/>
           </w:tcPr>
           <w:p>
+            <w:pPr>
+              <w:spacing w:after="0"/>
+            </w:pPr>
             <w:r>
               <w:rPr>
                 <w:b/>
+                <w:color w:val="1E3A8A"/>
                 <w:sz w:val="20"/>
               </w:rPr>
-              <w:t>Student Name(s) &amp; Division:</w:t>
+              <w:t>Candidate Name(s) &amp; Div:</w:t>
             </w:r>
           </w:p>
         </w:tc>
         <w:tc>
           <w:tcPr>
-            <w:tcW w:type="dxa" w:w="4680"/>
+            <w:tcW w:type="dxa" w:w="5616"/>
+            <w:tcMar>
+              <w:top w:w="100" w:type="dxa"/>
+              <w:bottom w:w="100" w:type="dxa"/>
+              <w:left w:w="150" w:type="dxa"/>
+              <w:right w:w="150" w:type="dxa"/>
+            </w:tcMar>
+            <w:shd w:val="clear" w:color="auto" w:fill="FFFFFF"/>
           </w:tcPr>
           <w:p>
+            <w:pPr>
+              <w:spacing w:after="0"/>
+            </w:pPr>
             <w:r>
               <w:rPr>
                 <w:sz w:val="20"/>
               </w:rPr>
-              <w:t>[Insert Student Names] | Division: [Insert Div]</w:t>
+              <w:t>[Insert Student Names] | Division: [Insert Division]</w:t>
             </w:r>
           </w:p>
         </w:tc>
@@ -171,24 +298,44 @@
       <w:tr>
         <w:tc>
           <w:tcPr>
-            <w:tcW w:type="dxa" w:w="4680"/>
+            <w:tcW w:type="dxa" w:w="3744"/>
+            <w:tcMar>
+              <w:top w:w="100" w:type="dxa"/>
+              <w:bottom w:w="100" w:type="dxa"/>
+              <w:left w:w="150" w:type="dxa"/>
+              <w:right w:w="150" w:type="dxa"/>
+            </w:tcMar>
             <w:shd w:val="clear" w:color="auto" w:fill="F1F5F9"/>
           </w:tcPr>
           <w:p>
+            <w:pPr>
+              <w:spacing w:after="0"/>
+            </w:pPr>
             <w:r>
               <w:rPr>
                 <w:b/>
+                <w:color w:val="1E3A8A"/>
                 <w:sz w:val="20"/>
               </w:rPr>
-              <w:t>Roll No(s) &amp; Student Code(s):</w:t>
+              <w:t>Roll Number(s) &amp; Student Code(s):</w:t>
             </w:r>
           </w:p>
         </w:tc>
         <w:tc>
           <w:tcPr>
-            <w:tcW w:type="dxa" w:w="4680"/>
+            <w:tcW w:type="dxa" w:w="5616"/>
+            <w:tcMar>
+              <w:top w:w="100" w:type="dxa"/>
+              <w:bottom w:w="100" w:type="dxa"/>
+              <w:left w:w="150" w:type="dxa"/>
+              <w:right w:w="150" w:type="dxa"/>
+            </w:tcMar>
+            <w:shd w:val="clear" w:color="auto" w:fill="FFFFFF"/>
           </w:tcPr>
           <w:p>
+            <w:pPr>
+              <w:spacing w:after="0"/>
+            </w:pPr>
             <w:r>
               <w:rPr>
                 <w:sz w:val="20"/>
@@ -199,14 +346,42 @@
         </w:tc>
       </w:tr>
     </w:tbl>
-    <w:p/>
+    <w:p>
+      <w:pPr>
+        <w:spacing w:after="120"/>
+      </w:pPr>
+    </w:p>
+    <w:p>
+      <w:pPr>
+        <w:spacing w:line="276" w:lineRule="auto" w:after="200"/>
+      </w:pPr>
+      <w:r>
+        <w:rPr>
+          <w:b/>
+        </w:rPr>
+        <w:t xml:space="preserve">Executive Abstract: </w:t>
+      </w:r>
+      <w:r>
+        <w:t>Credit lending constitutes the core profit-generating mechanism in retail and commercial banking. However, legacy manual underwriting processes require 3 to 7 business days, induce substantial operational overhead, suffer human cognitive fatigue and bias, and often fail to detect multivariate default risks. This project presents 'FinFlow', an intelligent end-to-end Financial Data Analysis and Management System. FinFlow harnesses machine learning algorithms (Random Forest, Gradient Boosting, Logistic Regression, and Decision Trees) trained on a 4,269-record banking benchmark dataset. By synthesizing domain-specific financial solvency metrics—such as the Asset Coverage Ratio (ACR), Debt-to-Income (DTI), and Loan-to-Income (LTI)—the system achieves an exceptional 96.49% accuracy and an ROC-AUC of 0.9948 on unseen test data. The system cuts underwriting latency to under 2 seconds, safeguards the lending institution against capital erosion (Type II errors), and is deployed as an interactive, production-ready Streamlit web application.</w:t>
+      </w:r>
+    </w:p>
+    <w:p>
+      <w:r>
+        <w:br w:type="page"/>
+      </w:r>
+    </w:p>
     <w:p>
       <w:pPr>
         <w:pStyle w:val="Heading1"/>
-        <w:spacing w:before="240" w:after="80"/>
+        <w:keepNext/>
+        <w:spacing w:before="280" w:after="80"/>
       </w:pPr>
       <w:r>
-        <w:t>1. Problem Definition</w:t>
+        <w:rPr>
+          <w:color w:val="1E3A8A"/>
+          <w:sz w:val="28"/>
+        </w:rPr>
+        <w:t>1. Problem Definition &amp; Banking Context</w:t>
       </w:r>
     </w:p>
     <w:p>
@@ -214,50 +389,71 @@
         <w:spacing w:line="276" w:lineRule="auto"/>
       </w:pPr>
       <w:r>
-        <w:t>In retail and commercial financial institutions, credit lending constitutes the primary revenue generator through the Net Interest Margin (NIM). However, conventional loan approval processes suffer from critical inefficiencies:</w:t>
-        <w:br/>
-        <w:t>1. High Operational Latency: Manual scrutiny of physical income statements, tax returns, and collateral documentation typically requires 3 to 7 business days per application.</w:t>
-        <w:br/>
-        <w:t>2. Human Bias &amp; Subjectivity: Discretionary underwriting decisions introduce inconsistencies, cognitive fatigue, and potential discrimination.</w:t>
-        <w:br/>
-        <w:t>3. Rise in Non-Performing Assets (NPAs): Traditional single-metric rules (such as arbitrary CIBIL cutoffs) overlook multidimensional interactions between debt burden, asset coverage, and disposable liquidity, leading to credit defaults that erode bank capital adequacy.</w:t>
+        <w:t>In modern financial management, the financial flow of a banking institution relies heavily on the Net Interest Margin (NIM)—the spread between the interest earned on disbursed loans and the interest paid on depositor capital. Loan approval and credit underwriting are the gatekeepers of this financial flow. However, conventional institutional lending faces three critical challenges:</w:t>
         <w:br/>
         <w:br/>
-        <w:t>Core Problem Statement: To design, develop, and benchmark an automated, intelligent Financial Data Analysis and Management System leveraging Machine Learning to accurately predict loan approval viability, quantify borrower risk, and optimize capital allocation while shielding the lender from credit default loss.</w:t>
+        <w:t>1. Excessive Operational Latency: Manual scrutiny of physical paystubs, property tax receipts, income tax returns, and bureau reports takes 3–7 business days, causing customer churn and inflated underwriting costs.</w:t>
+        <w:br/>
+        <w:t>2. Human Bias &amp; Subjectivity: Discretionary manual decisioning results in inconsistent lending practices, cognitive bias, and regulatory compliance risks.</w:t>
+        <w:br/>
+        <w:t>3. Rise in Non-Performing Assets (NPAs): Traditional banking heuristics rely on rigid, one-dimensional cutoff rules (e.g., 'Reject if CIBIL &lt; 650'). Such rules fail to assess multivariate interactions between collateral backing, cash flow obligations, and debt burden. This allows financially fragile applicants to be approved, causing credit defaults that directly deplete institutional equity reserves.</w:t>
+        <w:br/>
+        <w:br/>
+        <w:t>Core Problem Statement: To design, develop, and benchmark an automated, intelligent Financial Data Analysis and Management System using Machine Learning to accurately predict loan approval outcomes, quantify borrower credit risk, synthesize institutional solvency ratios, and optimize financial capital flow while mitigating credit default exposure.</w:t>
       </w:r>
     </w:p>
     <w:p>
       <w:pPr>
         <w:pStyle w:val="Heading1"/>
+        <w:keepNext/>
+        <w:spacing w:before="280" w:after="80"/>
       </w:pPr>
       <w:r>
-        <w:t>2. Measurable Objectives</w:t>
+        <w:rPr>
+          <w:color w:val="1E3A8A"/>
+          <w:sz w:val="28"/>
+        </w:rPr>
+        <w:t>2. Project Objectives</w:t>
       </w:r>
     </w:p>
     <w:p>
+      <w:pPr>
+        <w:spacing w:line="276" w:lineRule="auto"/>
+      </w:pPr>
       <w:r>
-        <w:t>• Underwriting Automation: Transition credit decisioning latency from multiple business days to under 2 seconds per applicant.</w:t>
+        <w:t>The project is structured around five measurable academic and operational objectives:</w:t>
         <w:br/>
-        <w:t>• Default Mitigation (High Precision): Achieve model classification accuracy and ROC-AUC exceeding 0.95, strictly minimizing False Positives (bad loans approved).</w:t>
+        <w:t>• Underwriting Automation: Reduce credit decisioning latency from days to under 2 seconds per application.</w:t>
         <w:br/>
-        <w:t>• Domain Ratio Engineering: Formulate and incorporate key financial ratios: Asset Coverage Ratio (ACR), Debt-to-Income (DTI), and Loan-to-Income (LTI).</w:t>
+        <w:t>• Capital Preservation (High Precision): Achieve model classification accuracy and ROC-AUC exceeding 0.95, strictly minimizing False Positives (Type II errors) where defaulting loans are mistakenly disbursed.</w:t>
         <w:br/>
-        <w:t>• Model Explainability: Deliver transparent feature importance weights to comply with fair lending guidelines and banking regulatory requirements.</w:t>
+        <w:t>• Domain Ratio Engineering: Formulate and integrate banking solvency ratios: Asset Coverage Ratio (ACR), Debt-to-Income Ratio (DTI), and Loan-to-Income Ratio (LTI).</w:t>
         <w:br/>
-        <w:t>• Full-Stack Deployment: Implement a modern, interactive Streamlit financial web dashboard supporting real-time underwriting and bulk batch CSV processing.</w:t>
+        <w:t>• Model Explainability &amp; Compliance: Provide transparent feature importance weights (such as CIBIL weighting and collateral contribution) to comply with regulatory fair-lending mandates.</w:t>
+        <w:br/>
+        <w:t>• Full-Stack Deployment: Develop an interactive, production-ready Streamlit dashboard supporting executive analytics, exploratory data analysis, real-time single-applicant underwriting, and batch CSV processing.</w:t>
       </w:r>
     </w:p>
     <w:p>
       <w:pPr>
         <w:pStyle w:val="Heading1"/>
+        <w:keepNext/>
+        <w:spacing w:before="280" w:after="80"/>
       </w:pPr>
       <w:r>
+        <w:rPr>
+          <w:color w:val="1E3A8A"/>
+          <w:sz w:val="28"/>
+        </w:rPr>
         <w:t>3. Dataset Description &amp; Financial Attributes</w:t>
       </w:r>
     </w:p>
     <w:p>
+      <w:pPr>
+        <w:spacing w:line="276" w:lineRule="auto"/>
+      </w:pPr>
       <w:r>
-        <w:t>The system utilizes a benchmark financial credit dataset of 4,269 historical loan records (Kaggle Financial / Credit Risk Benchmark repository). The target variable is 'loan_status' (Approved: 74.3%, Rejected: 25.7%), reflecting empirical banking portfolio distributions. All data is anonymized and adheres strictly to privacy standards with no confidential PII.</w:t>
+        <w:t>The underlying dataset is sourced from the Kaggle Financial Benchmark Repository (Loan Approval Prediction Dataset by Archit Sharma). It contains 4,269 historical loan records, with a target distribution of 74.3% Approved (3,172 records) and 25.7% Rejected (1,097 records), faithfully mirroring the actual approval rates of commercial retail banks. The dataset is fully anonymized and compliant with data privacy norms.</w:t>
       </w:r>
     </w:p>
     <w:tbl>
@@ -267,36 +463,51 @@
         <w:tblLook w:firstColumn="1" w:firstRow="1" w:lastColumn="0" w:lastRow="0" w:noHBand="0" w:noVBand="1" w:val="04A0"/>
       </w:tblPr>
       <w:tblGrid>
-        <w:gridCol w:w="3120"/>
-        <w:gridCol w:w="3120"/>
-        <w:gridCol w:w="3120"/>
+        <w:gridCol w:w="2257"/>
+        <w:gridCol w:w="2257"/>
+        <w:gridCol w:w="2257"/>
+        <w:gridCol w:w="2257"/>
       </w:tblGrid>
       <w:tr>
         <w:tc>
           <w:tcPr>
-            <w:tcW w:type="dxa" w:w="3120"/>
+            <w:tcW w:type="dxa" w:w="2257"/>
             <w:shd w:val="clear" w:color="auto" w:fill="1E3A8A"/>
+            <w:tcMar>
+              <w:top w:w="100" w:type="dxa"/>
+              <w:bottom w:w="100" w:type="dxa"/>
+              <w:left w:w="120" w:type="dxa"/>
+              <w:right w:w="120" w:type="dxa"/>
+            </w:tcMar>
           </w:tcPr>
           <w:p>
             <w:r>
               <w:rPr>
                 <w:b/>
                 <w:color w:val="FFFFFF"/>
+                <w:sz w:val="19"/>
               </w:rPr>
-              <w:t>Attribute Name</w:t>
+              <w:t>Feature Name</w:t>
             </w:r>
           </w:p>
         </w:tc>
         <w:tc>
           <w:tcPr>
-            <w:tcW w:type="dxa" w:w="3120"/>
+            <w:tcW w:type="dxa" w:w="2257"/>
             <w:shd w:val="clear" w:color="auto" w:fill="1E3A8A"/>
+            <w:tcMar>
+              <w:top w:w="100" w:type="dxa"/>
+              <w:bottom w:w="100" w:type="dxa"/>
+              <w:left w:w="120" w:type="dxa"/>
+              <w:right w:w="120" w:type="dxa"/>
+            </w:tcMar>
           </w:tcPr>
           <w:p>
             <w:r>
               <w:rPr>
                 <w:b/>
                 <w:color w:val="FFFFFF"/>
+                <w:sz w:val="19"/>
               </w:rPr>
               <w:t>Data Type</w:t>
             </w:r>
@@ -304,16 +515,45 @@
         </w:tc>
         <w:tc>
           <w:tcPr>
-            <w:tcW w:type="dxa" w:w="3120"/>
+            <w:tcW w:type="dxa" w:w="2257"/>
             <w:shd w:val="clear" w:color="auto" w:fill="1E3A8A"/>
+            <w:tcMar>
+              <w:top w:w="100" w:type="dxa"/>
+              <w:bottom w:w="100" w:type="dxa"/>
+              <w:left w:w="120" w:type="dxa"/>
+              <w:right w:w="120" w:type="dxa"/>
+            </w:tcMar>
           </w:tcPr>
           <w:p>
             <w:r>
               <w:rPr>
                 <w:b/>
                 <w:color w:val="FFFFFF"/>
+                <w:sz w:val="19"/>
               </w:rPr>
-              <w:t>Financial Significance</w:t>
+              <w:t>Value Range / Units</w:t>
+            </w:r>
+          </w:p>
+        </w:tc>
+        <w:tc>
+          <w:tcPr>
+            <w:tcW w:type="dxa" w:w="2257"/>
+            <w:shd w:val="clear" w:color="auto" w:fill="1E3A8A"/>
+            <w:tcMar>
+              <w:top w:w="100" w:type="dxa"/>
+              <w:bottom w:w="100" w:type="dxa"/>
+              <w:left w:w="120" w:type="dxa"/>
+              <w:right w:w="120" w:type="dxa"/>
+            </w:tcMar>
+          </w:tcPr>
+          <w:p>
+            <w:r>
+              <w:rPr>
+                <w:b/>
+                <w:color w:val="FFFFFF"/>
+                <w:sz w:val="19"/>
+              </w:rPr>
+              <w:t>Banking &amp; Financial Significance</w:t>
             </w:r>
           </w:p>
         </w:tc>
@@ -321,12 +561,18 @@
       <w:tr>
         <w:tc>
           <w:tcPr>
-            <w:tcW w:type="dxa" w:w="3120"/>
+            <w:tcW w:type="dxa" w:w="2257"/>
+            <w:tcMar>
+              <w:top w:w="70" w:type="dxa"/>
+              <w:bottom w:w="70" w:type="dxa"/>
+              <w:left w:w="100" w:type="dxa"/>
+              <w:right w:w="100" w:type="dxa"/>
+            </w:tcMar>
           </w:tcPr>
           <w:p>
             <w:r>
               <w:rPr>
-                <w:sz w:val="19"/>
+                <w:sz w:val="18"/>
               </w:rPr>
               <w:t>loan_id</w:t>
             </w:r>
@@ -334,12 +580,18 @@
         </w:tc>
         <w:tc>
           <w:tcPr>
-            <w:tcW w:type="dxa" w:w="3120"/>
+            <w:tcW w:type="dxa" w:w="2257"/>
+            <w:tcMar>
+              <w:top w:w="70" w:type="dxa"/>
+              <w:bottom w:w="70" w:type="dxa"/>
+              <w:left w:w="100" w:type="dxa"/>
+              <w:right w:w="100" w:type="dxa"/>
+            </w:tcMar>
           </w:tcPr>
           <w:p>
             <w:r>
               <w:rPr>
-                <w:sz w:val="19"/>
+                <w:sz w:val="18"/>
               </w:rPr>
               <w:t>String</w:t>
             </w:r>
@@ -347,14 +599,39 @@
         </w:tc>
         <w:tc>
           <w:tcPr>
-            <w:tcW w:type="dxa" w:w="3120"/>
+            <w:tcW w:type="dxa" w:w="2257"/>
+            <w:tcMar>
+              <w:top w:w="70" w:type="dxa"/>
+              <w:bottom w:w="70" w:type="dxa"/>
+              <w:left w:w="100" w:type="dxa"/>
+              <w:right w:w="100" w:type="dxa"/>
+            </w:tcMar>
           </w:tcPr>
           <w:p>
             <w:r>
               <w:rPr>
-                <w:sz w:val="19"/>
+                <w:sz w:val="18"/>
               </w:rPr>
-              <w:t>Unique application tracking code</w:t>
+              <w:t>Alphanumeric</w:t>
+            </w:r>
+          </w:p>
+        </w:tc>
+        <w:tc>
+          <w:tcPr>
+            <w:tcW w:type="dxa" w:w="2257"/>
+            <w:tcMar>
+              <w:top w:w="70" w:type="dxa"/>
+              <w:bottom w:w="70" w:type="dxa"/>
+              <w:left w:w="100" w:type="dxa"/>
+              <w:right w:w="100" w:type="dxa"/>
+            </w:tcMar>
+          </w:tcPr>
+          <w:p>
+            <w:r>
+              <w:rPr>
+                <w:sz w:val="18"/>
+              </w:rPr>
+              <w:t>Unique applicant identifier.</w:t>
             </w:r>
           </w:p>
         </w:tc>
@@ -362,12 +639,18 @@
       <w:tr>
         <w:tc>
           <w:tcPr>
-            <w:tcW w:type="dxa" w:w="3120"/>
+            <w:tcW w:type="dxa" w:w="2257"/>
+            <w:tcMar>
+              <w:top w:w="70" w:type="dxa"/>
+              <w:bottom w:w="70" w:type="dxa"/>
+              <w:left w:w="100" w:type="dxa"/>
+              <w:right w:w="100" w:type="dxa"/>
+            </w:tcMar>
           </w:tcPr>
           <w:p>
             <w:r>
               <w:rPr>
-                <w:sz w:val="19"/>
+                <w:sz w:val="18"/>
               </w:rPr>
               <w:t>no_of_dependents</w:t>
             </w:r>
@@ -375,12 +658,18 @@
         </w:tc>
         <w:tc>
           <w:tcPr>
-            <w:tcW w:type="dxa" w:w="3120"/>
+            <w:tcW w:type="dxa" w:w="2257"/>
+            <w:tcMar>
+              <w:top w:w="70" w:type="dxa"/>
+              <w:bottom w:w="70" w:type="dxa"/>
+              <w:left w:w="100" w:type="dxa"/>
+              <w:right w:w="100" w:type="dxa"/>
+            </w:tcMar>
           </w:tcPr>
           <w:p>
             <w:r>
               <w:rPr>
-                <w:sz w:val="19"/>
+                <w:sz w:val="18"/>
               </w:rPr>
               <w:t>Integer</w:t>
             </w:r>
@@ -388,14 +677,39 @@
         </w:tc>
         <w:tc>
           <w:tcPr>
-            <w:tcW w:type="dxa" w:w="3120"/>
+            <w:tcW w:type="dxa" w:w="2257"/>
+            <w:tcMar>
+              <w:top w:w="70" w:type="dxa"/>
+              <w:bottom w:w="70" w:type="dxa"/>
+              <w:left w:w="100" w:type="dxa"/>
+              <w:right w:w="100" w:type="dxa"/>
+            </w:tcMar>
           </w:tcPr>
           <w:p>
             <w:r>
               <w:rPr>
-                <w:sz w:val="19"/>
+                <w:sz w:val="18"/>
               </w:rPr>
-              <w:t>Dependent family members (0 to 5)</w:t>
+              <w:t>0 to 5</w:t>
+            </w:r>
+          </w:p>
+        </w:tc>
+        <w:tc>
+          <w:tcPr>
+            <w:tcW w:type="dxa" w:w="2257"/>
+            <w:tcMar>
+              <w:top w:w="70" w:type="dxa"/>
+              <w:bottom w:w="70" w:type="dxa"/>
+              <w:left w:w="100" w:type="dxa"/>
+              <w:right w:w="100" w:type="dxa"/>
+            </w:tcMar>
+          </w:tcPr>
+          <w:p>
+            <w:r>
+              <w:rPr>
+                <w:sz w:val="18"/>
+              </w:rPr>
+              <w:t>Financial dependents relying on applicant income.</w:t>
             </w:r>
           </w:p>
         </w:tc>
@@ -403,12 +717,18 @@
       <w:tr>
         <w:tc>
           <w:tcPr>
-            <w:tcW w:type="dxa" w:w="3120"/>
+            <w:tcW w:type="dxa" w:w="2257"/>
+            <w:tcMar>
+              <w:top w:w="70" w:type="dxa"/>
+              <w:bottom w:w="70" w:type="dxa"/>
+              <w:left w:w="100" w:type="dxa"/>
+              <w:right w:w="100" w:type="dxa"/>
+            </w:tcMar>
           </w:tcPr>
           <w:p>
             <w:r>
               <w:rPr>
-                <w:sz w:val="19"/>
+                <w:sz w:val="18"/>
               </w:rPr>
               <w:t>education</w:t>
             </w:r>
@@ -416,12 +736,18 @@
         </w:tc>
         <w:tc>
           <w:tcPr>
-            <w:tcW w:type="dxa" w:w="3120"/>
+            <w:tcW w:type="dxa" w:w="2257"/>
+            <w:tcMar>
+              <w:top w:w="70" w:type="dxa"/>
+              <w:bottom w:w="70" w:type="dxa"/>
+              <w:left w:w="100" w:type="dxa"/>
+              <w:right w:w="100" w:type="dxa"/>
+            </w:tcMar>
           </w:tcPr>
           <w:p>
             <w:r>
               <w:rPr>
-                <w:sz w:val="19"/>
+                <w:sz w:val="18"/>
               </w:rPr>
               <w:t>Categorical</w:t>
             </w:r>
@@ -429,14 +755,39 @@
         </w:tc>
         <w:tc>
           <w:tcPr>
-            <w:tcW w:type="dxa" w:w="3120"/>
+            <w:tcW w:type="dxa" w:w="2257"/>
+            <w:tcMar>
+              <w:top w:w="70" w:type="dxa"/>
+              <w:bottom w:w="70" w:type="dxa"/>
+              <w:left w:w="100" w:type="dxa"/>
+              <w:right w:w="100" w:type="dxa"/>
+            </w:tcMar>
           </w:tcPr>
           <w:p>
             <w:r>
               <w:rPr>
-                <w:sz w:val="19"/>
+                <w:sz w:val="18"/>
               </w:rPr>
               <w:t>Graduate / Not Graduate</w:t>
+            </w:r>
+          </w:p>
+        </w:tc>
+        <w:tc>
+          <w:tcPr>
+            <w:tcW w:type="dxa" w:w="2257"/>
+            <w:tcMar>
+              <w:top w:w="70" w:type="dxa"/>
+              <w:bottom w:w="70" w:type="dxa"/>
+              <w:left w:w="100" w:type="dxa"/>
+              <w:right w:w="100" w:type="dxa"/>
+            </w:tcMar>
+          </w:tcPr>
+          <w:p>
+            <w:r>
+              <w:rPr>
+                <w:sz w:val="18"/>
+              </w:rPr>
+              <w:t>Educational attainment indicating income stability.</w:t>
             </w:r>
           </w:p>
         </w:tc>
@@ -444,12 +795,18 @@
       <w:tr>
         <w:tc>
           <w:tcPr>
-            <w:tcW w:type="dxa" w:w="3120"/>
+            <w:tcW w:type="dxa" w:w="2257"/>
+            <w:tcMar>
+              <w:top w:w="70" w:type="dxa"/>
+              <w:bottom w:w="70" w:type="dxa"/>
+              <w:left w:w="100" w:type="dxa"/>
+              <w:right w:w="100" w:type="dxa"/>
+            </w:tcMar>
           </w:tcPr>
           <w:p>
             <w:r>
               <w:rPr>
-                <w:sz w:val="19"/>
+                <w:sz w:val="18"/>
               </w:rPr>
               <w:t>self_employed</w:t>
             </w:r>
@@ -457,12 +814,18 @@
         </w:tc>
         <w:tc>
           <w:tcPr>
-            <w:tcW w:type="dxa" w:w="3120"/>
+            <w:tcW w:type="dxa" w:w="2257"/>
+            <w:tcMar>
+              <w:top w:w="70" w:type="dxa"/>
+              <w:bottom w:w="70" w:type="dxa"/>
+              <w:left w:w="100" w:type="dxa"/>
+              <w:right w:w="100" w:type="dxa"/>
+            </w:tcMar>
           </w:tcPr>
           <w:p>
             <w:r>
               <w:rPr>
-                <w:sz w:val="19"/>
+                <w:sz w:val="18"/>
               </w:rPr>
               <w:t>Categorical</w:t>
             </w:r>
@@ -470,14 +833,39 @@
         </w:tc>
         <w:tc>
           <w:tcPr>
-            <w:tcW w:type="dxa" w:w="3120"/>
+            <w:tcW w:type="dxa" w:w="2257"/>
+            <w:tcMar>
+              <w:top w:w="70" w:type="dxa"/>
+              <w:bottom w:w="70" w:type="dxa"/>
+              <w:left w:w="100" w:type="dxa"/>
+              <w:right w:w="100" w:type="dxa"/>
+            </w:tcMar>
           </w:tcPr>
           <w:p>
             <w:r>
               <w:rPr>
-                <w:sz w:val="19"/>
+                <w:sz w:val="18"/>
               </w:rPr>
-              <w:t>Yes (Business/Self-Employed) / No (Salaried)</w:t>
+              <w:t>Yes / No</w:t>
+            </w:r>
+          </w:p>
+        </w:tc>
+        <w:tc>
+          <w:tcPr>
+            <w:tcW w:type="dxa" w:w="2257"/>
+            <w:tcMar>
+              <w:top w:w="70" w:type="dxa"/>
+              <w:bottom w:w="70" w:type="dxa"/>
+              <w:left w:w="100" w:type="dxa"/>
+              <w:right w:w="100" w:type="dxa"/>
+            </w:tcMar>
+          </w:tcPr>
+          <w:p>
+            <w:r>
+              <w:rPr>
+                <w:sz w:val="18"/>
+              </w:rPr>
+              <w:t>Employment type: Business/Self-Employed vs Salaried.</w:t>
             </w:r>
           </w:p>
         </w:tc>
@@ -485,12 +873,18 @@
       <w:tr>
         <w:tc>
           <w:tcPr>
-            <w:tcW w:type="dxa" w:w="3120"/>
+            <w:tcW w:type="dxa" w:w="2257"/>
+            <w:tcMar>
+              <w:top w:w="70" w:type="dxa"/>
+              <w:bottom w:w="70" w:type="dxa"/>
+              <w:left w:w="100" w:type="dxa"/>
+              <w:right w:w="100" w:type="dxa"/>
+            </w:tcMar>
           </w:tcPr>
           <w:p>
             <w:r>
               <w:rPr>
-                <w:sz w:val="19"/>
+                <w:sz w:val="18"/>
               </w:rPr>
               <w:t>income_annum</w:t>
             </w:r>
@@ -498,27 +892,58 @@
         </w:tc>
         <w:tc>
           <w:tcPr>
-            <w:tcW w:type="dxa" w:w="3120"/>
+            <w:tcW w:type="dxa" w:w="2257"/>
+            <w:tcMar>
+              <w:top w:w="70" w:type="dxa"/>
+              <w:bottom w:w="70" w:type="dxa"/>
+              <w:left w:w="100" w:type="dxa"/>
+              <w:right w:w="100" w:type="dxa"/>
+            </w:tcMar>
           </w:tcPr>
           <w:p>
             <w:r>
               <w:rPr>
-                <w:sz w:val="19"/>
+                <w:sz w:val="18"/>
               </w:rPr>
-              <w:t>Numeric (INR)</w:t>
+              <w:t>Numeric</w:t>
             </w:r>
           </w:p>
         </w:tc>
         <w:tc>
           <w:tcPr>
-            <w:tcW w:type="dxa" w:w="3120"/>
+            <w:tcW w:type="dxa" w:w="2257"/>
+            <w:tcMar>
+              <w:top w:w="70" w:type="dxa"/>
+              <w:bottom w:w="70" w:type="dxa"/>
+              <w:left w:w="100" w:type="dxa"/>
+              <w:right w:w="100" w:type="dxa"/>
+            </w:tcMar>
           </w:tcPr>
           <w:p>
             <w:r>
               <w:rPr>
-                <w:sz w:val="19"/>
+                <w:sz w:val="18"/>
               </w:rPr>
-              <w:t>Gross annual applicant income</w:t>
+              <w:t>₹2,00,000 to ₹1,50,00,000</w:t>
+            </w:r>
+          </w:p>
+        </w:tc>
+        <w:tc>
+          <w:tcPr>
+            <w:tcW w:type="dxa" w:w="2257"/>
+            <w:tcMar>
+              <w:top w:w="70" w:type="dxa"/>
+              <w:bottom w:w="70" w:type="dxa"/>
+              <w:left w:w="100" w:type="dxa"/>
+              <w:right w:w="100" w:type="dxa"/>
+            </w:tcMar>
+          </w:tcPr>
+          <w:p>
+            <w:r>
+              <w:rPr>
+                <w:sz w:val="18"/>
+              </w:rPr>
+              <w:t>Annual gross income of the primary applicant.</w:t>
             </w:r>
           </w:p>
         </w:tc>
@@ -526,12 +951,18 @@
       <w:tr>
         <w:tc>
           <w:tcPr>
-            <w:tcW w:type="dxa" w:w="3120"/>
+            <w:tcW w:type="dxa" w:w="2257"/>
+            <w:tcMar>
+              <w:top w:w="70" w:type="dxa"/>
+              <w:bottom w:w="70" w:type="dxa"/>
+              <w:left w:w="100" w:type="dxa"/>
+              <w:right w:w="100" w:type="dxa"/>
+            </w:tcMar>
           </w:tcPr>
           <w:p>
             <w:r>
               <w:rPr>
-                <w:sz w:val="19"/>
+                <w:sz w:val="18"/>
               </w:rPr>
               <w:t>loan_amount</w:t>
             </w:r>
@@ -539,27 +970,58 @@
         </w:tc>
         <w:tc>
           <w:tcPr>
-            <w:tcW w:type="dxa" w:w="3120"/>
+            <w:tcW w:type="dxa" w:w="2257"/>
+            <w:tcMar>
+              <w:top w:w="70" w:type="dxa"/>
+              <w:bottom w:w="70" w:type="dxa"/>
+              <w:left w:w="100" w:type="dxa"/>
+              <w:right w:w="100" w:type="dxa"/>
+            </w:tcMar>
           </w:tcPr>
           <w:p>
             <w:r>
               <w:rPr>
-                <w:sz w:val="19"/>
+                <w:sz w:val="18"/>
               </w:rPr>
-              <w:t>Numeric (INR)</w:t>
+              <w:t>Numeric</w:t>
             </w:r>
           </w:p>
         </w:tc>
         <w:tc>
           <w:tcPr>
-            <w:tcW w:type="dxa" w:w="3120"/>
+            <w:tcW w:type="dxa" w:w="2257"/>
+            <w:tcMar>
+              <w:top w:w="70" w:type="dxa"/>
+              <w:bottom w:w="70" w:type="dxa"/>
+              <w:left w:w="100" w:type="dxa"/>
+              <w:right w:w="100" w:type="dxa"/>
+            </w:tcMar>
           </w:tcPr>
           <w:p>
             <w:r>
               <w:rPr>
-                <w:sz w:val="19"/>
+                <w:sz w:val="18"/>
               </w:rPr>
-              <w:t>Requested principal loan disbursement</w:t>
+              <w:t>₹1,00,000 to ₹4,50,00,000</w:t>
+            </w:r>
+          </w:p>
+        </w:tc>
+        <w:tc>
+          <w:tcPr>
+            <w:tcW w:type="dxa" w:w="2257"/>
+            <w:tcMar>
+              <w:top w:w="70" w:type="dxa"/>
+              <w:bottom w:w="70" w:type="dxa"/>
+              <w:left w:w="100" w:type="dxa"/>
+              <w:right w:w="100" w:type="dxa"/>
+            </w:tcMar>
+          </w:tcPr>
+          <w:p>
+            <w:r>
+              <w:rPr>
+                <w:sz w:val="18"/>
+              </w:rPr>
+              <w:t>Principal loan amount requested for disbursement.</w:t>
             </w:r>
           </w:p>
         </w:tc>
@@ -567,12 +1029,18 @@
       <w:tr>
         <w:tc>
           <w:tcPr>
-            <w:tcW w:type="dxa" w:w="3120"/>
+            <w:tcW w:type="dxa" w:w="2257"/>
+            <w:tcMar>
+              <w:top w:w="70" w:type="dxa"/>
+              <w:bottom w:w="70" w:type="dxa"/>
+              <w:left w:w="100" w:type="dxa"/>
+              <w:right w:w="100" w:type="dxa"/>
+            </w:tcMar>
           </w:tcPr>
           <w:p>
             <w:r>
               <w:rPr>
-                <w:sz w:val="19"/>
+                <w:sz w:val="18"/>
               </w:rPr>
               <w:t>loan_term</w:t>
             </w:r>
@@ -580,27 +1048,58 @@
         </w:tc>
         <w:tc>
           <w:tcPr>
-            <w:tcW w:type="dxa" w:w="3120"/>
+            <w:tcW w:type="dxa" w:w="2257"/>
+            <w:tcMar>
+              <w:top w:w="70" w:type="dxa"/>
+              <w:bottom w:w="70" w:type="dxa"/>
+              <w:left w:w="100" w:type="dxa"/>
+              <w:right w:w="100" w:type="dxa"/>
+            </w:tcMar>
           </w:tcPr>
           <w:p>
             <w:r>
               <w:rPr>
-                <w:sz w:val="19"/>
+                <w:sz w:val="18"/>
               </w:rPr>
-              <w:t>Numeric (Years)</w:t>
+              <w:t>Numeric</w:t>
             </w:r>
           </w:p>
         </w:tc>
         <w:tc>
           <w:tcPr>
-            <w:tcW w:type="dxa" w:w="3120"/>
+            <w:tcW w:type="dxa" w:w="2257"/>
+            <w:tcMar>
+              <w:top w:w="70" w:type="dxa"/>
+              <w:bottom w:w="70" w:type="dxa"/>
+              <w:left w:w="100" w:type="dxa"/>
+              <w:right w:w="100" w:type="dxa"/>
+            </w:tcMar>
           </w:tcPr>
           <w:p>
             <w:r>
               <w:rPr>
-                <w:sz w:val="19"/>
+                <w:sz w:val="18"/>
               </w:rPr>
-              <w:t>Loan tenure / repayment term (2 to 20 years)</w:t>
+              <w:t>2 to 20 Years</w:t>
+            </w:r>
+          </w:p>
+        </w:tc>
+        <w:tc>
+          <w:tcPr>
+            <w:tcW w:type="dxa" w:w="2257"/>
+            <w:tcMar>
+              <w:top w:w="70" w:type="dxa"/>
+              <w:bottom w:w="70" w:type="dxa"/>
+              <w:left w:w="100" w:type="dxa"/>
+              <w:right w:w="100" w:type="dxa"/>
+            </w:tcMar>
+          </w:tcPr>
+          <w:p>
+            <w:r>
+              <w:rPr>
+                <w:sz w:val="18"/>
+              </w:rPr>
+              <w:t>Amortization period / repayment duration.</w:t>
             </w:r>
           </w:p>
         </w:tc>
@@ -608,12 +1107,18 @@
       <w:tr>
         <w:tc>
           <w:tcPr>
-            <w:tcW w:type="dxa" w:w="3120"/>
+            <w:tcW w:type="dxa" w:w="2257"/>
+            <w:tcMar>
+              <w:top w:w="70" w:type="dxa"/>
+              <w:bottom w:w="70" w:type="dxa"/>
+              <w:left w:w="100" w:type="dxa"/>
+              <w:right w:w="100" w:type="dxa"/>
+            </w:tcMar>
           </w:tcPr>
           <w:p>
             <w:r>
               <w:rPr>
-                <w:sz w:val="19"/>
+                <w:sz w:val="18"/>
               </w:rPr>
               <w:t>cibil_score</w:t>
             </w:r>
@@ -621,27 +1126,58 @@
         </w:tc>
         <w:tc>
           <w:tcPr>
-            <w:tcW w:type="dxa" w:w="3120"/>
+            <w:tcW w:type="dxa" w:w="2257"/>
+            <w:tcMar>
+              <w:top w:w="70" w:type="dxa"/>
+              <w:bottom w:w="70" w:type="dxa"/>
+              <w:left w:w="100" w:type="dxa"/>
+              <w:right w:w="100" w:type="dxa"/>
+            </w:tcMar>
           </w:tcPr>
           <w:p>
             <w:r>
               <w:rPr>
-                <w:sz w:val="19"/>
+                <w:sz w:val="18"/>
               </w:rPr>
-              <w:t>Integer (300-900)</w:t>
+              <w:t>Integer</w:t>
             </w:r>
           </w:p>
         </w:tc>
         <w:tc>
           <w:tcPr>
-            <w:tcW w:type="dxa" w:w="3120"/>
+            <w:tcW w:type="dxa" w:w="2257"/>
+            <w:tcMar>
+              <w:top w:w="70" w:type="dxa"/>
+              <w:bottom w:w="70" w:type="dxa"/>
+              <w:left w:w="100" w:type="dxa"/>
+              <w:right w:w="100" w:type="dxa"/>
+            </w:tcMar>
           </w:tcPr>
           <w:p>
             <w:r>
               <w:rPr>
-                <w:sz w:val="19"/>
+                <w:sz w:val="18"/>
               </w:rPr>
-              <w:t>Credit bureau score reflecting repayment history</w:t>
+              <w:t>300 to 900</w:t>
+            </w:r>
+          </w:p>
+        </w:tc>
+        <w:tc>
+          <w:tcPr>
+            <w:tcW w:type="dxa" w:w="2257"/>
+            <w:tcMar>
+              <w:top w:w="70" w:type="dxa"/>
+              <w:bottom w:w="70" w:type="dxa"/>
+              <w:left w:w="100" w:type="dxa"/>
+              <w:right w:w="100" w:type="dxa"/>
+            </w:tcMar>
+          </w:tcPr>
+          <w:p>
+            <w:r>
+              <w:rPr>
+                <w:sz w:val="18"/>
+              </w:rPr>
+              <w:t>Credit Bureau score tracking repayment discipline.</w:t>
             </w:r>
           </w:p>
         </w:tc>
@@ -649,12 +1185,18 @@
       <w:tr>
         <w:tc>
           <w:tcPr>
-            <w:tcW w:type="dxa" w:w="3120"/>
+            <w:tcW w:type="dxa" w:w="2257"/>
+            <w:tcMar>
+              <w:top w:w="70" w:type="dxa"/>
+              <w:bottom w:w="70" w:type="dxa"/>
+              <w:left w:w="100" w:type="dxa"/>
+              <w:right w:w="100" w:type="dxa"/>
+            </w:tcMar>
           </w:tcPr>
           <w:p>
             <w:r>
               <w:rPr>
-                <w:sz w:val="19"/>
+                <w:sz w:val="18"/>
               </w:rPr>
               <w:t>residential_assets_value</w:t>
             </w:r>
@@ -662,27 +1204,58 @@
         </w:tc>
         <w:tc>
           <w:tcPr>
-            <w:tcW w:type="dxa" w:w="3120"/>
+            <w:tcW w:type="dxa" w:w="2257"/>
+            <w:tcMar>
+              <w:top w:w="70" w:type="dxa"/>
+              <w:bottom w:w="70" w:type="dxa"/>
+              <w:left w:w="100" w:type="dxa"/>
+              <w:right w:w="100" w:type="dxa"/>
+            </w:tcMar>
           </w:tcPr>
           <w:p>
             <w:r>
               <w:rPr>
-                <w:sz w:val="19"/>
+                <w:sz w:val="18"/>
               </w:rPr>
-              <w:t>Numeric (INR)</w:t>
+              <w:t>Numeric</w:t>
             </w:r>
           </w:p>
         </w:tc>
         <w:tc>
           <w:tcPr>
-            <w:tcW w:type="dxa" w:w="3120"/>
+            <w:tcW w:type="dxa" w:w="2257"/>
+            <w:tcMar>
+              <w:top w:w="70" w:type="dxa"/>
+              <w:bottom w:w="70" w:type="dxa"/>
+              <w:left w:w="100" w:type="dxa"/>
+              <w:right w:w="100" w:type="dxa"/>
+            </w:tcMar>
           </w:tcPr>
           <w:p>
             <w:r>
               <w:rPr>
-                <w:sz w:val="19"/>
+                <w:sz w:val="18"/>
               </w:rPr>
-              <w:t>Valuation of residential real estate collateral</w:t>
+              <w:t>₹0 to ₹3,00,00,000</w:t>
+            </w:r>
+          </w:p>
+        </w:tc>
+        <w:tc>
+          <w:tcPr>
+            <w:tcW w:type="dxa" w:w="2257"/>
+            <w:tcMar>
+              <w:top w:w="70" w:type="dxa"/>
+              <w:bottom w:w="70" w:type="dxa"/>
+              <w:left w:w="100" w:type="dxa"/>
+              <w:right w:w="100" w:type="dxa"/>
+            </w:tcMar>
+          </w:tcPr>
+          <w:p>
+            <w:r>
+              <w:rPr>
+                <w:sz w:val="18"/>
+              </w:rPr>
+              <w:t>Market valuation of residential real estate collateral.</w:t>
             </w:r>
           </w:p>
         </w:tc>
@@ -690,12 +1263,18 @@
       <w:tr>
         <w:tc>
           <w:tcPr>
-            <w:tcW w:type="dxa" w:w="3120"/>
+            <w:tcW w:type="dxa" w:w="2257"/>
+            <w:tcMar>
+              <w:top w:w="70" w:type="dxa"/>
+              <w:bottom w:w="70" w:type="dxa"/>
+              <w:left w:w="100" w:type="dxa"/>
+              <w:right w:w="100" w:type="dxa"/>
+            </w:tcMar>
           </w:tcPr>
           <w:p>
             <w:r>
               <w:rPr>
-                <w:sz w:val="19"/>
+                <w:sz w:val="18"/>
               </w:rPr>
               <w:t>commercial_assets_value</w:t>
             </w:r>
@@ -703,27 +1282,58 @@
         </w:tc>
         <w:tc>
           <w:tcPr>
-            <w:tcW w:type="dxa" w:w="3120"/>
+            <w:tcW w:type="dxa" w:w="2257"/>
+            <w:tcMar>
+              <w:top w:w="70" w:type="dxa"/>
+              <w:bottom w:w="70" w:type="dxa"/>
+              <w:left w:w="100" w:type="dxa"/>
+              <w:right w:w="100" w:type="dxa"/>
+            </w:tcMar>
           </w:tcPr>
           <w:p>
             <w:r>
               <w:rPr>
-                <w:sz w:val="19"/>
+                <w:sz w:val="18"/>
               </w:rPr>
-              <w:t>Numeric (INR)</w:t>
+              <w:t>Numeric</w:t>
             </w:r>
           </w:p>
         </w:tc>
         <w:tc>
           <w:tcPr>
-            <w:tcW w:type="dxa" w:w="3120"/>
+            <w:tcW w:type="dxa" w:w="2257"/>
+            <w:tcMar>
+              <w:top w:w="70" w:type="dxa"/>
+              <w:bottom w:w="70" w:type="dxa"/>
+              <w:left w:w="100" w:type="dxa"/>
+              <w:right w:w="100" w:type="dxa"/>
+            </w:tcMar>
           </w:tcPr>
           <w:p>
             <w:r>
               <w:rPr>
-                <w:sz w:val="19"/>
+                <w:sz w:val="18"/>
               </w:rPr>
-              <w:t>Valuation of commercial real estate collateral</w:t>
+              <w:t>₹0 to ₹2,50,00,000</w:t>
+            </w:r>
+          </w:p>
+        </w:tc>
+        <w:tc>
+          <w:tcPr>
+            <w:tcW w:type="dxa" w:w="2257"/>
+            <w:tcMar>
+              <w:top w:w="70" w:type="dxa"/>
+              <w:bottom w:w="70" w:type="dxa"/>
+              <w:left w:w="100" w:type="dxa"/>
+              <w:right w:w="100" w:type="dxa"/>
+            </w:tcMar>
+          </w:tcPr>
+          <w:p>
+            <w:r>
+              <w:rPr>
+                <w:sz w:val="18"/>
+              </w:rPr>
+              <w:t>Market valuation of commercial offices / real estate.</w:t>
             </w:r>
           </w:p>
         </w:tc>
@@ -731,12 +1341,18 @@
       <w:tr>
         <w:tc>
           <w:tcPr>
-            <w:tcW w:type="dxa" w:w="3120"/>
+            <w:tcW w:type="dxa" w:w="2257"/>
+            <w:tcMar>
+              <w:top w:w="70" w:type="dxa"/>
+              <w:bottom w:w="70" w:type="dxa"/>
+              <w:left w:w="100" w:type="dxa"/>
+              <w:right w:w="100" w:type="dxa"/>
+            </w:tcMar>
           </w:tcPr>
           <w:p>
             <w:r>
               <w:rPr>
-                <w:sz w:val="19"/>
+                <w:sz w:val="18"/>
               </w:rPr>
               <w:t>luxury_assets_value</w:t>
             </w:r>
@@ -744,27 +1360,58 @@
         </w:tc>
         <w:tc>
           <w:tcPr>
-            <w:tcW w:type="dxa" w:w="3120"/>
+            <w:tcW w:type="dxa" w:w="2257"/>
+            <w:tcMar>
+              <w:top w:w="70" w:type="dxa"/>
+              <w:bottom w:w="70" w:type="dxa"/>
+              <w:left w:w="100" w:type="dxa"/>
+              <w:right w:w="100" w:type="dxa"/>
+            </w:tcMar>
           </w:tcPr>
           <w:p>
             <w:r>
               <w:rPr>
-                <w:sz w:val="19"/>
+                <w:sz w:val="18"/>
               </w:rPr>
-              <w:t>Numeric (INR)</w:t>
+              <w:t>Numeric</w:t>
             </w:r>
           </w:p>
         </w:tc>
         <w:tc>
           <w:tcPr>
-            <w:tcW w:type="dxa" w:w="3120"/>
+            <w:tcW w:type="dxa" w:w="2257"/>
+            <w:tcMar>
+              <w:top w:w="70" w:type="dxa"/>
+              <w:bottom w:w="70" w:type="dxa"/>
+              <w:left w:w="100" w:type="dxa"/>
+              <w:right w:w="100" w:type="dxa"/>
+            </w:tcMar>
           </w:tcPr>
           <w:p>
             <w:r>
               <w:rPr>
-                <w:sz w:val="19"/>
+                <w:sz w:val="18"/>
               </w:rPr>
-              <w:t>Valuation of vehicles, jewelry, and luxury assets</w:t>
+              <w:t>₹1,00,000 to ₹2,00,00,000</w:t>
+            </w:r>
+          </w:p>
+        </w:tc>
+        <w:tc>
+          <w:tcPr>
+            <w:tcW w:type="dxa" w:w="2257"/>
+            <w:tcMar>
+              <w:top w:w="70" w:type="dxa"/>
+              <w:bottom w:w="70" w:type="dxa"/>
+              <w:left w:w="100" w:type="dxa"/>
+              <w:right w:w="100" w:type="dxa"/>
+            </w:tcMar>
+          </w:tcPr>
+          <w:p>
+            <w:r>
+              <w:rPr>
+                <w:sz w:val="18"/>
+              </w:rPr>
+              <w:t>Market valuation of vehicles, gold, jewellery, art.</w:t>
             </w:r>
           </w:p>
         </w:tc>
@@ -772,12 +1419,18 @@
       <w:tr>
         <w:tc>
           <w:tcPr>
-            <w:tcW w:type="dxa" w:w="3120"/>
+            <w:tcW w:type="dxa" w:w="2257"/>
+            <w:tcMar>
+              <w:top w:w="70" w:type="dxa"/>
+              <w:bottom w:w="70" w:type="dxa"/>
+              <w:left w:w="100" w:type="dxa"/>
+              <w:right w:w="100" w:type="dxa"/>
+            </w:tcMar>
           </w:tcPr>
           <w:p>
             <w:r>
               <w:rPr>
-                <w:sz w:val="19"/>
+                <w:sz w:val="18"/>
               </w:rPr>
               <w:t>bank_asset_value</w:t>
             </w:r>
@@ -785,27 +1438,58 @@
         </w:tc>
         <w:tc>
           <w:tcPr>
-            <w:tcW w:type="dxa" w:w="3120"/>
+            <w:tcW w:type="dxa" w:w="2257"/>
+            <w:tcMar>
+              <w:top w:w="70" w:type="dxa"/>
+              <w:bottom w:w="70" w:type="dxa"/>
+              <w:left w:w="100" w:type="dxa"/>
+              <w:right w:w="100" w:type="dxa"/>
+            </w:tcMar>
           </w:tcPr>
           <w:p>
             <w:r>
               <w:rPr>
-                <w:sz w:val="19"/>
+                <w:sz w:val="18"/>
               </w:rPr>
-              <w:t>Numeric (INR)</w:t>
+              <w:t>Numeric</w:t>
             </w:r>
           </w:p>
         </w:tc>
         <w:tc>
           <w:tcPr>
-            <w:tcW w:type="dxa" w:w="3120"/>
+            <w:tcW w:type="dxa" w:w="2257"/>
+            <w:tcMar>
+              <w:top w:w="70" w:type="dxa"/>
+              <w:bottom w:w="70" w:type="dxa"/>
+              <w:left w:w="100" w:type="dxa"/>
+              <w:right w:w="100" w:type="dxa"/>
+            </w:tcMar>
           </w:tcPr>
           <w:p>
             <w:r>
               <w:rPr>
-                <w:sz w:val="19"/>
+                <w:sz w:val="18"/>
               </w:rPr>
-              <w:t>Liquid cash deposits and savings accounts</w:t>
+              <w:t>₹50,000 to ₹1,80,00,000</w:t>
+            </w:r>
+          </w:p>
+        </w:tc>
+        <w:tc>
+          <w:tcPr>
+            <w:tcW w:type="dxa" w:w="2257"/>
+            <w:tcMar>
+              <w:top w:w="70" w:type="dxa"/>
+              <w:bottom w:w="70" w:type="dxa"/>
+              <w:left w:w="100" w:type="dxa"/>
+              <w:right w:w="100" w:type="dxa"/>
+            </w:tcMar>
+          </w:tcPr>
+          <w:p>
+            <w:r>
+              <w:rPr>
+                <w:sz w:val="18"/>
+              </w:rPr>
+              <w:t>Liquid bank balances, savings, and fixed deposits.</w:t>
             </w:r>
           </w:p>
         </w:tc>
@@ -813,40 +1497,77 @@
       <w:tr>
         <w:tc>
           <w:tcPr>
-            <w:tcW w:type="dxa" w:w="3120"/>
+            <w:tcW w:type="dxa" w:w="2257"/>
+            <w:tcMar>
+              <w:top w:w="70" w:type="dxa"/>
+              <w:bottom w:w="70" w:type="dxa"/>
+              <w:left w:w="100" w:type="dxa"/>
+              <w:right w:w="100" w:type="dxa"/>
+            </w:tcMar>
           </w:tcPr>
           <w:p>
             <w:r>
               <w:rPr>
-                <w:sz w:val="19"/>
+                <w:sz w:val="18"/>
               </w:rPr>
-              <w:t>loan_status</w:t>
+              <w:t>loan_status (Target)</w:t>
             </w:r>
           </w:p>
         </w:tc>
         <w:tc>
           <w:tcPr>
-            <w:tcW w:type="dxa" w:w="3120"/>
+            <w:tcW w:type="dxa" w:w="2257"/>
+            <w:tcMar>
+              <w:top w:w="70" w:type="dxa"/>
+              <w:bottom w:w="70" w:type="dxa"/>
+              <w:left w:w="100" w:type="dxa"/>
+              <w:right w:w="100" w:type="dxa"/>
+            </w:tcMar>
           </w:tcPr>
           <w:p>
             <w:r>
               <w:rPr>
-                <w:sz w:val="19"/>
+                <w:sz w:val="18"/>
               </w:rPr>
-              <w:t>Categorical (Target)</w:t>
+              <w:t>Categorical</w:t>
             </w:r>
           </w:p>
         </w:tc>
         <w:tc>
           <w:tcPr>
-            <w:tcW w:type="dxa" w:w="3120"/>
+            <w:tcW w:type="dxa" w:w="2257"/>
+            <w:tcMar>
+              <w:top w:w="70" w:type="dxa"/>
+              <w:bottom w:w="70" w:type="dxa"/>
+              <w:left w:w="100" w:type="dxa"/>
+              <w:right w:w="100" w:type="dxa"/>
+            </w:tcMar>
           </w:tcPr>
           <w:p>
             <w:r>
               <w:rPr>
-                <w:sz w:val="19"/>
+                <w:sz w:val="18"/>
               </w:rPr>
               <w:t>Approved (1) / Rejected (0)</w:t>
+            </w:r>
+          </w:p>
+        </w:tc>
+        <w:tc>
+          <w:tcPr>
+            <w:tcW w:type="dxa" w:w="2257"/>
+            <w:tcMar>
+              <w:top w:w="70" w:type="dxa"/>
+              <w:bottom w:w="70" w:type="dxa"/>
+              <w:left w:w="100" w:type="dxa"/>
+              <w:right w:w="100" w:type="dxa"/>
+            </w:tcMar>
+          </w:tcPr>
+          <w:p>
+            <w:r>
+              <w:rPr>
+                <w:sz w:val="18"/>
+              </w:rPr>
+              <w:t>Ground truth underwriting outcome.</w:t>
             </w:r>
           </w:p>
         </w:tc>
@@ -854,38 +1575,121 @@
     </w:tbl>
     <w:p>
       <w:pPr>
+        <w:spacing w:after="160"/>
+      </w:pPr>
+    </w:p>
+    <w:p>
+      <w:pPr>
         <w:pStyle w:val="Heading1"/>
+        <w:keepNext/>
+        <w:spacing w:before="280" w:after="80"/>
       </w:pPr>
       <w:r>
-        <w:t>4. System &amp; Solution Architecture</w:t>
+        <w:rPr>
+          <w:color w:val="1E3A8A"/>
+          <w:sz w:val="28"/>
+        </w:rPr>
+        <w:t>4. Mathematical Formulations &amp; Feature Engineering</w:t>
       </w:r>
     </w:p>
     <w:p>
+      <w:pPr>
+        <w:spacing w:line="276" w:lineRule="auto"/>
+      </w:pPr>
       <w:r>
-        <w:t>The solution is structured as a robust 5-tier architecture:</w:t>
+        <w:t>To elevate the system to institutional banking standards, our data processor pipeline synthesizes four high-impact financial ratios:</w:t>
         <w:br/>
-        <w:t>1. Ingestion Layer: CSV parser and dynamic Streamlit input forms.</w:t>
         <w:br/>
-        <w:t>2. Domain Preprocessing Pipeline: Feature engineering computing Asset Coverage Ratio (Collateral/Loan) and Debt-to-Income (Debt Service/Income), categorical mapping, and StandardScaler normalization.</w:t>
+        <w:t>1. Total Collateral Assets (Assets_total):</w:t>
         <w:br/>
-        <w:t>3. Machine Learning Engine: Multi-model suite (Random Forest, Gradient Boosting, Logistic Regression, Decision Tree) trained and serialized via joblib.</w:t>
+        <w:t xml:space="preserve">   Assets_total = Assets_residential + Assets_commercial + Assets_luxury + Assets_bank</w:t>
         <w:br/>
-        <w:t>4. Risk Underwriting Layer: Probability scoring against calibrated threshold (tau = 0.50) with automated credit commentary.</w:t>
         <w:br/>
-        <w:t>5. Presentation Layer: Multi-tab interactive Streamlit web dashboard.</w:t>
+        <w:t>2. Asset Coverage Ratio (ACR) — Solvency &amp; Recovery Metric:</w:t>
+        <w:br/>
+        <w:t xml:space="preserve">   ACR = Assets_total / (Loan_Amount + 1)</w:t>
+        <w:br/>
+        <w:t xml:space="preserve">   Significance: If ACR &gt; 1.5, the loan is backed by 150%+ collateral coverage. Upon default, the bank can recover 100% of the loan principal through collateral liquidation.</w:t>
+        <w:br/>
+        <w:br/>
+        <w:t>3. Debt-to-Income Ratio (DTI) — Liquidity &amp; Cash Flow Metric:</w:t>
+        <w:br/>
+        <w:t xml:space="preserve">   Annual Debt Service = Loan_Amount / Loan_Term</w:t>
+        <w:br/>
+        <w:t xml:space="preserve">   DTI = Annual Debt Service / (Income_Annum + 1)</w:t>
+        <w:br/>
+        <w:t xml:space="preserve">   Significance: In commercial credit, a DTI &gt; 0.45 indicates severe cash flow vulnerability, where loan EMIs consume an excessive portion of gross income.</w:t>
+        <w:br/>
+        <w:br/>
+        <w:t>4. Loan-to-Income Ratio (LTI) — Financial Leverage Multiplier:</w:t>
+        <w:br/>
+        <w:t xml:space="preserve">   LTI = Loan_Amount / (Income_Annum + 1)</w:t>
+        <w:br/>
+        <w:t xml:space="preserve">   Significance: Multiplier measuring how many years of gross salary the requested loan represents.</w:t>
       </w:r>
     </w:p>
     <w:p>
       <w:pPr>
         <w:pStyle w:val="Heading1"/>
+        <w:keepNext/>
+        <w:spacing w:before="280" w:after="80"/>
       </w:pPr>
       <w:r>
-        <w:t>5. Implementation, Testing &amp; Benchmark Results</w:t>
+        <w:rPr>
+          <w:color w:val="1E3A8A"/>
+          <w:sz w:val="28"/>
+        </w:rPr>
+        <w:t>5. Machine Learning Models &amp; Mathematical Functions</w:t>
       </w:r>
     </w:p>
     <w:p>
+      <w:pPr>
+        <w:spacing w:line="276" w:lineRule="auto"/>
+      </w:pPr>
       <w:r>
-        <w:t>Models were evaluated using an 80/20 stratified split (3,415 train records, 854 holdout test records). Below is the empirical quantitative benchmark across the four algorithms:</w:t>
+        <w:t>The system evaluates four distinct supervised classification architectures:</w:t>
+        <w:br/>
+        <w:br/>
+        <w:t>• Logistic Regression (Linear Probabilistic Model):</w:t>
+        <w:br/>
+        <w:t xml:space="preserve">  Maps linear feature combinations through the Sigmoid function: P(Approved | x) = 1 / (1 + e^(-z)), where z = w^T * x + b.   Trained by minimizing Binary Cross-Entropy (Log Loss). Provides regulatory transparency and calibrated odds ratios.</w:t>
+        <w:br/>
+        <w:br/>
+        <w:t>• Decision Tree Classifier (Non-linear Hierarchical Split):</w:t>
+        <w:br/>
+        <w:t xml:space="preserve">  Constructs binary decision splits using Gini Impurity: Gini(p) = 1 - sum(p_k^2).   Maximizes Information Gain to produce transparent threshold rules.</w:t>
+        <w:br/>
+        <w:br/>
+        <w:t>• Random Forest Classifier (Bagging Ensemble of 120 Trees):</w:t>
+        <w:br/>
+        <w:t xml:space="preserve">  Fits 120 decorrelated decision trees on bootstrap subsets of the training data with random feature selection.   Averages tree outputs: P_RF = (1/B) * sum(P_b). Drastically suppresses variance and handles collinear asset valuations.</w:t>
+        <w:br/>
+        <w:br/>
+        <w:t>• Gradient Boosting Classifier (Sequential Residual Minimization):</w:t>
+        <w:br/>
+        <w:t xml:space="preserve">  Iteratively builds shallow decision trees where each new learner fits to the negative gradient (pseudo-residuals) of the preceding loss.   Delivers benchmark classification power on tabular structured data.</w:t>
+      </w:r>
+    </w:p>
+    <w:p>
+      <w:pPr>
+        <w:pStyle w:val="Heading1"/>
+        <w:keepNext/>
+        <w:spacing w:before="280" w:after="80"/>
+      </w:pPr>
+      <w:r>
+        <w:rPr>
+          <w:color w:val="1E3A8A"/>
+          <w:sz w:val="28"/>
+        </w:rPr>
+        <w:t>6. Testing, Evaluation &amp; Empirical Results</w:t>
+      </w:r>
+    </w:p>
+    <w:p>
+      <w:pPr>
+        <w:spacing w:line="276" w:lineRule="auto"/>
+      </w:pPr>
+      <w:r>
+        <w:t>Testing Methodology: An 80/20 Stratified Train-Test Split was executed (3,415 training records, 854 holdout test records), preserving the natural 74:26 class ratio. The models were evaluated using Accuracy, Precision, Recall, F1-Score, and ROC-AUC.</w:t>
       </w:r>
     </w:p>
     <w:tbl>
@@ -895,24 +1699,31 @@
         <w:tblLook w:firstColumn="1" w:firstRow="1" w:lastColumn="0" w:lastRow="0" w:noHBand="0" w:noVBand="1" w:val="04A0"/>
       </w:tblPr>
       <w:tblGrid>
-        <w:gridCol w:w="1560"/>
-        <w:gridCol w:w="1560"/>
-        <w:gridCol w:w="1560"/>
-        <w:gridCol w:w="1560"/>
-        <w:gridCol w:w="1560"/>
-        <w:gridCol w:w="1560"/>
+        <w:gridCol w:w="1505"/>
+        <w:gridCol w:w="1505"/>
+        <w:gridCol w:w="1505"/>
+        <w:gridCol w:w="1505"/>
+        <w:gridCol w:w="1505"/>
+        <w:gridCol w:w="1505"/>
       </w:tblGrid>
       <w:tr>
         <w:tc>
           <w:tcPr>
-            <w:tcW w:type="dxa" w:w="1560"/>
+            <w:tcW w:type="dxa" w:w="1505"/>
             <w:shd w:val="clear" w:color="auto" w:fill="1E3A8A"/>
+            <w:tcMar>
+              <w:top w:w="100" w:type="dxa"/>
+              <w:bottom w:w="100" w:type="dxa"/>
+              <w:left w:w="120" w:type="dxa"/>
+              <w:right w:w="120" w:type="dxa"/>
+            </w:tcMar>
           </w:tcPr>
           <w:p>
             <w:r>
               <w:rPr>
                 <w:b/>
                 <w:color w:val="FFFFFF"/>
+                <w:sz w:val="19"/>
               </w:rPr>
               <w:t>Model Algorithm</w:t>
             </w:r>
@@ -920,14 +1731,21 @@
         </w:tc>
         <w:tc>
           <w:tcPr>
-            <w:tcW w:type="dxa" w:w="1560"/>
+            <w:tcW w:type="dxa" w:w="1505"/>
             <w:shd w:val="clear" w:color="auto" w:fill="1E3A8A"/>
+            <w:tcMar>
+              <w:top w:w="100" w:type="dxa"/>
+              <w:bottom w:w="100" w:type="dxa"/>
+              <w:left w:w="120" w:type="dxa"/>
+              <w:right w:w="120" w:type="dxa"/>
+            </w:tcMar>
           </w:tcPr>
           <w:p>
             <w:r>
               <w:rPr>
                 <w:b/>
                 <w:color w:val="FFFFFF"/>
+                <w:sz w:val="19"/>
               </w:rPr>
               <w:t>Accuracy</w:t>
             </w:r>
@@ -935,14 +1753,21 @@
         </w:tc>
         <w:tc>
           <w:tcPr>
-            <w:tcW w:type="dxa" w:w="1560"/>
+            <w:tcW w:type="dxa" w:w="1505"/>
             <w:shd w:val="clear" w:color="auto" w:fill="1E3A8A"/>
+            <w:tcMar>
+              <w:top w:w="100" w:type="dxa"/>
+              <w:bottom w:w="100" w:type="dxa"/>
+              <w:left w:w="120" w:type="dxa"/>
+              <w:right w:w="120" w:type="dxa"/>
+            </w:tcMar>
           </w:tcPr>
           <w:p>
             <w:r>
               <w:rPr>
                 <w:b/>
                 <w:color w:val="FFFFFF"/>
+                <w:sz w:val="19"/>
               </w:rPr>
               <w:t>Precision</w:t>
             </w:r>
@@ -950,14 +1775,21 @@
         </w:tc>
         <w:tc>
           <w:tcPr>
-            <w:tcW w:type="dxa" w:w="1560"/>
+            <w:tcW w:type="dxa" w:w="1505"/>
             <w:shd w:val="clear" w:color="auto" w:fill="1E3A8A"/>
+            <w:tcMar>
+              <w:top w:w="100" w:type="dxa"/>
+              <w:bottom w:w="100" w:type="dxa"/>
+              <w:left w:w="120" w:type="dxa"/>
+              <w:right w:w="120" w:type="dxa"/>
+            </w:tcMar>
           </w:tcPr>
           <w:p>
             <w:r>
               <w:rPr>
                 <w:b/>
                 <w:color w:val="FFFFFF"/>
+                <w:sz w:val="19"/>
               </w:rPr>
               <w:t>Recall</w:t>
             </w:r>
@@ -965,29 +1797,43 @@
         </w:tc>
         <w:tc>
           <w:tcPr>
-            <w:tcW w:type="dxa" w:w="1560"/>
+            <w:tcW w:type="dxa" w:w="1505"/>
             <w:shd w:val="clear" w:color="auto" w:fill="1E3A8A"/>
+            <w:tcMar>
+              <w:top w:w="100" w:type="dxa"/>
+              <w:bottom w:w="100" w:type="dxa"/>
+              <w:left w:w="120" w:type="dxa"/>
+              <w:right w:w="120" w:type="dxa"/>
+            </w:tcMar>
           </w:tcPr>
           <w:p>
             <w:r>
               <w:rPr>
                 <w:b/>
                 <w:color w:val="FFFFFF"/>
+                <w:sz w:val="19"/>
               </w:rPr>
-              <w:t>F1 Score</w:t>
+              <w:t>F1-Score</w:t>
             </w:r>
           </w:p>
         </w:tc>
         <w:tc>
           <w:tcPr>
-            <w:tcW w:type="dxa" w:w="1560"/>
+            <w:tcW w:type="dxa" w:w="1505"/>
             <w:shd w:val="clear" w:color="auto" w:fill="1E3A8A"/>
+            <w:tcMar>
+              <w:top w:w="100" w:type="dxa"/>
+              <w:bottom w:w="100" w:type="dxa"/>
+              <w:left w:w="120" w:type="dxa"/>
+              <w:right w:w="120" w:type="dxa"/>
+            </w:tcMar>
           </w:tcPr>
           <w:p>
             <w:r>
               <w:rPr>
                 <w:b/>
                 <w:color w:val="FFFFFF"/>
+                <w:sz w:val="19"/>
               </w:rPr>
               <w:t>ROC-AUC</w:t>
             </w:r>
@@ -997,12 +1843,19 @@
       <w:tr>
         <w:tc>
           <w:tcPr>
-            <w:tcW w:type="dxa" w:w="1560"/>
+            <w:tcW w:type="dxa" w:w="1505"/>
+            <w:tcMar>
+              <w:top w:w="70" w:type="dxa"/>
+              <w:bottom w:w="70" w:type="dxa"/>
+              <w:left w:w="100" w:type="dxa"/>
+              <w:right w:w="100" w:type="dxa"/>
+            </w:tcMar>
           </w:tcPr>
           <w:p>
             <w:r>
               <w:rPr>
-                <w:sz w:val="19"/>
+                <w:b/>
+                <w:sz w:val="18"/>
               </w:rPr>
               <w:t>Logistic Regression</w:t>
             </w:r>
@@ -1010,12 +1863,19 @@
         </w:tc>
         <w:tc>
           <w:tcPr>
-            <w:tcW w:type="dxa" w:w="1560"/>
+            <w:tcW w:type="dxa" w:w="1505"/>
+            <w:tcMar>
+              <w:top w:w="70" w:type="dxa"/>
+              <w:bottom w:w="70" w:type="dxa"/>
+              <w:left w:w="100" w:type="dxa"/>
+              <w:right w:w="100" w:type="dxa"/>
+            </w:tcMar>
           </w:tcPr>
           <w:p>
             <w:r>
               <w:rPr>
-                <w:sz w:val="19"/>
+                <w:b/>
+                <w:sz w:val="18"/>
               </w:rPr>
               <w:t>96.49%</w:t>
             </w:r>
@@ -1023,12 +1883,18 @@
         </w:tc>
         <w:tc>
           <w:tcPr>
-            <w:tcW w:type="dxa" w:w="1560"/>
+            <w:tcW w:type="dxa" w:w="1505"/>
+            <w:tcMar>
+              <w:top w:w="70" w:type="dxa"/>
+              <w:bottom w:w="70" w:type="dxa"/>
+              <w:left w:w="100" w:type="dxa"/>
+              <w:right w:w="100" w:type="dxa"/>
+            </w:tcMar>
           </w:tcPr>
           <w:p>
             <w:r>
               <w:rPr>
-                <w:sz w:val="19"/>
+                <w:sz w:val="18"/>
               </w:rPr>
               <w:t>97.34%</w:t>
             </w:r>
@@ -1036,12 +1902,18 @@
         </w:tc>
         <w:tc>
           <w:tcPr>
-            <w:tcW w:type="dxa" w:w="1560"/>
+            <w:tcW w:type="dxa" w:w="1505"/>
+            <w:tcMar>
+              <w:top w:w="70" w:type="dxa"/>
+              <w:bottom w:w="70" w:type="dxa"/>
+              <w:left w:w="100" w:type="dxa"/>
+              <w:right w:w="100" w:type="dxa"/>
+            </w:tcMar>
           </w:tcPr>
           <w:p>
             <w:r>
               <w:rPr>
-                <w:sz w:val="19"/>
+                <w:sz w:val="18"/>
               </w:rPr>
               <w:t>97.95%</w:t>
             </w:r>
@@ -1049,12 +1921,18 @@
         </w:tc>
         <w:tc>
           <w:tcPr>
-            <w:tcW w:type="dxa" w:w="1560"/>
+            <w:tcW w:type="dxa" w:w="1505"/>
+            <w:tcMar>
+              <w:top w:w="70" w:type="dxa"/>
+              <w:bottom w:w="70" w:type="dxa"/>
+              <w:left w:w="100" w:type="dxa"/>
+              <w:right w:w="100" w:type="dxa"/>
+            </w:tcMar>
           </w:tcPr>
           <w:p>
             <w:r>
               <w:rPr>
-                <w:sz w:val="19"/>
+                <w:sz w:val="18"/>
               </w:rPr>
               <w:t>97.65%</w:t>
             </w:r>
@@ -1062,12 +1940,18 @@
         </w:tc>
         <w:tc>
           <w:tcPr>
-            <w:tcW w:type="dxa" w:w="1560"/>
+            <w:tcW w:type="dxa" w:w="1505"/>
+            <w:tcMar>
+              <w:top w:w="70" w:type="dxa"/>
+              <w:bottom w:w="70" w:type="dxa"/>
+              <w:left w:w="100" w:type="dxa"/>
+              <w:right w:w="100" w:type="dxa"/>
+            </w:tcMar>
           </w:tcPr>
           <w:p>
             <w:r>
               <w:rPr>
-                <w:sz w:val="19"/>
+                <w:sz w:val="18"/>
               </w:rPr>
               <w:t>0.9948</w:t>
             </w:r>
@@ -1077,12 +1961,19 @@
       <w:tr>
         <w:tc>
           <w:tcPr>
-            <w:tcW w:type="dxa" w:w="1560"/>
+            <w:tcW w:type="dxa" w:w="1505"/>
+            <w:tcMar>
+              <w:top w:w="70" w:type="dxa"/>
+              <w:bottom w:w="70" w:type="dxa"/>
+              <w:left w:w="100" w:type="dxa"/>
+              <w:right w:w="100" w:type="dxa"/>
+            </w:tcMar>
           </w:tcPr>
           <w:p>
             <w:r>
               <w:rPr>
-                <w:sz w:val="19"/>
+                <w:b/>
+                <w:sz w:val="18"/>
               </w:rPr>
               <w:t>Random Forest</w:t>
             </w:r>
@@ -1090,12 +1981,19 @@
         </w:tc>
         <w:tc>
           <w:tcPr>
-            <w:tcW w:type="dxa" w:w="1560"/>
+            <w:tcW w:type="dxa" w:w="1505"/>
+            <w:tcMar>
+              <w:top w:w="70" w:type="dxa"/>
+              <w:bottom w:w="70" w:type="dxa"/>
+              <w:left w:w="100" w:type="dxa"/>
+              <w:right w:w="100" w:type="dxa"/>
+            </w:tcMar>
           </w:tcPr>
           <w:p>
             <w:r>
               <w:rPr>
-                <w:sz w:val="19"/>
+                <w:b/>
+                <w:sz w:val="18"/>
               </w:rPr>
               <w:t>95.32%</w:t>
             </w:r>
@@ -1103,12 +2001,18 @@
         </w:tc>
         <w:tc>
           <w:tcPr>
-            <w:tcW w:type="dxa" w:w="1560"/>
+            <w:tcW w:type="dxa" w:w="1505"/>
+            <w:tcMar>
+              <w:top w:w="70" w:type="dxa"/>
+              <w:bottom w:w="70" w:type="dxa"/>
+              <w:left w:w="100" w:type="dxa"/>
+              <w:right w:w="100" w:type="dxa"/>
+            </w:tcMar>
           </w:tcPr>
           <w:p>
             <w:r>
               <w:rPr>
-                <w:sz w:val="19"/>
+                <w:sz w:val="18"/>
               </w:rPr>
               <w:t>95.98%</w:t>
             </w:r>
@@ -1116,12 +2020,18 @@
         </w:tc>
         <w:tc>
           <w:tcPr>
-            <w:tcW w:type="dxa" w:w="1560"/>
+            <w:tcW w:type="dxa" w:w="1505"/>
+            <w:tcMar>
+              <w:top w:w="70" w:type="dxa"/>
+              <w:bottom w:w="70" w:type="dxa"/>
+              <w:left w:w="100" w:type="dxa"/>
+              <w:right w:w="100" w:type="dxa"/>
+            </w:tcMar>
           </w:tcPr>
           <w:p>
             <w:r>
               <w:rPr>
-                <w:sz w:val="19"/>
+                <w:sz w:val="18"/>
               </w:rPr>
               <w:t>97.80%</w:t>
             </w:r>
@@ -1129,12 +2039,18 @@
         </w:tc>
         <w:tc>
           <w:tcPr>
-            <w:tcW w:type="dxa" w:w="1560"/>
+            <w:tcW w:type="dxa" w:w="1505"/>
+            <w:tcMar>
+              <w:top w:w="70" w:type="dxa"/>
+              <w:bottom w:w="70" w:type="dxa"/>
+              <w:left w:w="100" w:type="dxa"/>
+              <w:right w:w="100" w:type="dxa"/>
+            </w:tcMar>
           </w:tcPr>
           <w:p>
             <w:r>
               <w:rPr>
-                <w:sz w:val="19"/>
+                <w:sz w:val="18"/>
               </w:rPr>
               <w:t>96.88%</w:t>
             </w:r>
@@ -1142,12 +2058,18 @@
         </w:tc>
         <w:tc>
           <w:tcPr>
-            <w:tcW w:type="dxa" w:w="1560"/>
+            <w:tcW w:type="dxa" w:w="1505"/>
+            <w:tcMar>
+              <w:top w:w="70" w:type="dxa"/>
+              <w:bottom w:w="70" w:type="dxa"/>
+              <w:left w:w="100" w:type="dxa"/>
+              <w:right w:w="100" w:type="dxa"/>
+            </w:tcMar>
           </w:tcPr>
           <w:p>
             <w:r>
               <w:rPr>
-                <w:sz w:val="19"/>
+                <w:sz w:val="18"/>
               </w:rPr>
               <w:t>0.9869</w:t>
             </w:r>
@@ -1157,12 +2079,19 @@
       <w:tr>
         <w:tc>
           <w:tcPr>
-            <w:tcW w:type="dxa" w:w="1560"/>
+            <w:tcW w:type="dxa" w:w="1505"/>
+            <w:tcMar>
+              <w:top w:w="70" w:type="dxa"/>
+              <w:bottom w:w="70" w:type="dxa"/>
+              <w:left w:w="100" w:type="dxa"/>
+              <w:right w:w="100" w:type="dxa"/>
+            </w:tcMar>
           </w:tcPr>
           <w:p>
             <w:r>
               <w:rPr>
-                <w:sz w:val="19"/>
+                <w:b/>
+                <w:sz w:val="18"/>
               </w:rPr>
               <w:t>Gradient Boosting</w:t>
             </w:r>
@@ -1170,12 +2099,19 @@
         </w:tc>
         <w:tc>
           <w:tcPr>
-            <w:tcW w:type="dxa" w:w="1560"/>
+            <w:tcW w:type="dxa" w:w="1505"/>
+            <w:tcMar>
+              <w:top w:w="70" w:type="dxa"/>
+              <w:bottom w:w="70" w:type="dxa"/>
+              <w:left w:w="100" w:type="dxa"/>
+              <w:right w:w="100" w:type="dxa"/>
+            </w:tcMar>
           </w:tcPr>
           <w:p>
             <w:r>
               <w:rPr>
-                <w:sz w:val="19"/>
+                <w:b/>
+                <w:sz w:val="18"/>
               </w:rPr>
               <w:t>95.08%</w:t>
             </w:r>
@@ -1183,12 +2119,18 @@
         </w:tc>
         <w:tc>
           <w:tcPr>
-            <w:tcW w:type="dxa" w:w="1560"/>
+            <w:tcW w:type="dxa" w:w="1505"/>
+            <w:tcMar>
+              <w:top w:w="70" w:type="dxa"/>
+              <w:bottom w:w="70" w:type="dxa"/>
+              <w:left w:w="100" w:type="dxa"/>
+              <w:right w:w="100" w:type="dxa"/>
+            </w:tcMar>
           </w:tcPr>
           <w:p>
             <w:r>
               <w:rPr>
-                <w:sz w:val="19"/>
+                <w:sz w:val="18"/>
               </w:rPr>
               <w:t>96.55%</w:t>
             </w:r>
@@ -1196,12 +2138,18 @@
         </w:tc>
         <w:tc>
           <w:tcPr>
-            <w:tcW w:type="dxa" w:w="1560"/>
+            <w:tcW w:type="dxa" w:w="1505"/>
+            <w:tcMar>
+              <w:top w:w="70" w:type="dxa"/>
+              <w:bottom w:w="70" w:type="dxa"/>
+              <w:left w:w="100" w:type="dxa"/>
+              <w:right w:w="100" w:type="dxa"/>
+            </w:tcMar>
           </w:tcPr>
           <w:p>
             <w:r>
               <w:rPr>
-                <w:sz w:val="19"/>
+                <w:sz w:val="18"/>
               </w:rPr>
               <w:t>96.85%</w:t>
             </w:r>
@@ -1209,12 +2157,18 @@
         </w:tc>
         <w:tc>
           <w:tcPr>
-            <w:tcW w:type="dxa" w:w="1560"/>
+            <w:tcW w:type="dxa" w:w="1505"/>
+            <w:tcMar>
+              <w:top w:w="70" w:type="dxa"/>
+              <w:bottom w:w="70" w:type="dxa"/>
+              <w:left w:w="100" w:type="dxa"/>
+              <w:right w:w="100" w:type="dxa"/>
+            </w:tcMar>
           </w:tcPr>
           <w:p>
             <w:r>
               <w:rPr>
-                <w:sz w:val="19"/>
+                <w:sz w:val="18"/>
               </w:rPr>
               <w:t>96.70%</w:t>
             </w:r>
@@ -1222,12 +2176,18 @@
         </w:tc>
         <w:tc>
           <w:tcPr>
-            <w:tcW w:type="dxa" w:w="1560"/>
+            <w:tcW w:type="dxa" w:w="1505"/>
+            <w:tcMar>
+              <w:top w:w="70" w:type="dxa"/>
+              <w:bottom w:w="70" w:type="dxa"/>
+              <w:left w:w="100" w:type="dxa"/>
+              <w:right w:w="100" w:type="dxa"/>
+            </w:tcMar>
           </w:tcPr>
           <w:p>
             <w:r>
               <w:rPr>
-                <w:sz w:val="19"/>
+                <w:sz w:val="18"/>
               </w:rPr>
               <w:t>0.9907</w:t>
             </w:r>
@@ -1237,12 +2197,19 @@
       <w:tr>
         <w:tc>
           <w:tcPr>
-            <w:tcW w:type="dxa" w:w="1560"/>
+            <w:tcW w:type="dxa" w:w="1505"/>
+            <w:tcMar>
+              <w:top w:w="70" w:type="dxa"/>
+              <w:bottom w:w="70" w:type="dxa"/>
+              <w:left w:w="100" w:type="dxa"/>
+              <w:right w:w="100" w:type="dxa"/>
+            </w:tcMar>
           </w:tcPr>
           <w:p>
             <w:r>
               <w:rPr>
-                <w:sz w:val="19"/>
+                <w:b/>
+                <w:sz w:val="18"/>
               </w:rPr>
               <w:t>Decision Tree</w:t>
             </w:r>
@@ -1250,12 +2217,19 @@
         </w:tc>
         <w:tc>
           <w:tcPr>
-            <w:tcW w:type="dxa" w:w="1560"/>
+            <w:tcW w:type="dxa" w:w="1505"/>
+            <w:tcMar>
+              <w:top w:w="70" w:type="dxa"/>
+              <w:bottom w:w="70" w:type="dxa"/>
+              <w:left w:w="100" w:type="dxa"/>
+              <w:right w:w="100" w:type="dxa"/>
+            </w:tcMar>
           </w:tcPr>
           <w:p>
             <w:r>
               <w:rPr>
-                <w:sz w:val="19"/>
+                <w:b/>
+                <w:sz w:val="18"/>
               </w:rPr>
               <w:t>92.86%</w:t>
             </w:r>
@@ -1263,12 +2237,18 @@
         </w:tc>
         <w:tc>
           <w:tcPr>
-            <w:tcW w:type="dxa" w:w="1560"/>
+            <w:tcW w:type="dxa" w:w="1505"/>
+            <w:tcMar>
+              <w:top w:w="70" w:type="dxa"/>
+              <w:bottom w:w="70" w:type="dxa"/>
+              <w:left w:w="100" w:type="dxa"/>
+              <w:right w:w="100" w:type="dxa"/>
+            </w:tcMar>
           </w:tcPr>
           <w:p>
             <w:r>
               <w:rPr>
-                <w:sz w:val="19"/>
+                <w:sz w:val="18"/>
               </w:rPr>
               <w:t>93.88%</w:t>
             </w:r>
@@ -1276,12 +2256,18 @@
         </w:tc>
         <w:tc>
           <w:tcPr>
-            <w:tcW w:type="dxa" w:w="1560"/>
+            <w:tcW w:type="dxa" w:w="1505"/>
+            <w:tcMar>
+              <w:top w:w="70" w:type="dxa"/>
+              <w:bottom w:w="70" w:type="dxa"/>
+              <w:left w:w="100" w:type="dxa"/>
+              <w:right w:w="100" w:type="dxa"/>
+            </w:tcMar>
           </w:tcPr>
           <w:p>
             <w:r>
               <w:rPr>
-                <w:sz w:val="19"/>
+                <w:sz w:val="18"/>
               </w:rPr>
               <w:t>96.69%</w:t>
             </w:r>
@@ -1289,12 +2275,18 @@
         </w:tc>
         <w:tc>
           <w:tcPr>
-            <w:tcW w:type="dxa" w:w="1560"/>
+            <w:tcW w:type="dxa" w:w="1505"/>
+            <w:tcMar>
+              <w:top w:w="70" w:type="dxa"/>
+              <w:bottom w:w="70" w:type="dxa"/>
+              <w:left w:w="100" w:type="dxa"/>
+              <w:right w:w="100" w:type="dxa"/>
+            </w:tcMar>
           </w:tcPr>
           <w:p>
             <w:r>
               <w:rPr>
-                <w:sz w:val="19"/>
+                <w:sz w:val="18"/>
               </w:rPr>
               <w:t>95.27%</w:t>
             </w:r>
@@ -1302,12 +2294,18 @@
         </w:tc>
         <w:tc>
           <w:tcPr>
-            <w:tcW w:type="dxa" w:w="1560"/>
+            <w:tcW w:type="dxa" w:w="1505"/>
+            <w:tcMar>
+              <w:top w:w="70" w:type="dxa"/>
+              <w:bottom w:w="70" w:type="dxa"/>
+              <w:left w:w="100" w:type="dxa"/>
+              <w:right w:w="100" w:type="dxa"/>
+            </w:tcMar>
           </w:tcPr>
           <w:p>
             <w:r>
               <w:rPr>
-                <w:sz w:val="19"/>
+                <w:sz w:val="18"/>
               </w:rPr>
               <w:t>0.9170</w:t>
             </w:r>
@@ -1316,60 +2314,141 @@
       </w:tr>
     </w:tbl>
     <w:p>
+      <w:pPr>
+        <w:spacing w:after="160"/>
+      </w:pPr>
+    </w:p>
+    <w:p>
+      <w:pPr>
+        <w:spacing w:line="276" w:lineRule="auto"/>
+      </w:pPr>
       <w:r>
+        <w:t>Feature Importance Ranking (Random Forest):</w:t>
         <w:br/>
-        <w:t>Key Observations from Testing:</w:t>
+        <w:t>• CIBIL / Credit Bureau Score: 32.4% relative importance (strongest predictor of repayment discipline).</w:t>
         <w:br/>
-        <w:t>• All four algorithms exceeded 92% accuracy, with Logistic Regression and Random Forest achieving outstanding generalization (&gt;95%).</w:t>
+        <w:t>• Asset Coverage Ratio (ACR): 17.8% (collateral solvency buffer).</w:t>
         <w:br/>
-        <w:t>• Feature Importance ranking revealed CIBIL Score as the #1 predictive driver (~32% weight), followed by Asset Coverage Ratio (~18%) and Debt-to-Income (~14%).</w:t>
+        <w:t>• Debt-to-Income Ratio (DTI): 14.1% (annual repayment cash flow stress).</w:t>
         <w:br/>
-        <w:t>• The ROC-AUC of 0.9948 indicates virtually flawless discrimination between creditworthy applicants and potential defaulters.</w:t>
+        <w:t>• Loan-to-Income (LTI): 11.6% (borrower financial leverage).</w:t>
+        <w:br/>
+        <w:t>• Bank Liquid Assets &amp; Income: 13.5% (immediate cash cushion).</w:t>
+        <w:br/>
+        <w:t>• Demographics (Dependents, Education, Employment): 10.6%.</w:t>
       </w:r>
     </w:p>
     <w:p>
       <w:pPr>
         <w:pStyle w:val="Heading1"/>
+        <w:keepNext/>
+        <w:spacing w:before="280" w:after="80"/>
       </w:pPr>
       <w:r>
-        <w:t>6. Financial Flow &amp; Risk Management Analysis</w:t>
+        <w:rPr>
+          <w:color w:val="1E3A8A"/>
+          <w:sz w:val="28"/>
+        </w:rPr>
+        <w:t>7. Financial Flow Management &amp; Error Asymmetry Analysis</w:t>
       </w:r>
     </w:p>
     <w:p>
+      <w:pPr>
+        <w:spacing w:line="276" w:lineRule="auto"/>
+      </w:pPr>
       <w:r>
-        <w:t>In institutional banking, managing financial flow requires balancing capital deployment against credit default hazard:</w:t>
+        <w:t>In retail and commercial banking, managing financial flow requires balancing capital deployment against credit default hazard:</w:t>
         <w:br/>
-        <w:t>• Type I Error (False Negative): Denying a creditworthy applicant. Cost = Forfeited net interest margin (opportunity loss of 3-4% margin), but principal remains safe.</w:t>
         <w:br/>
-        <w:t>• Type II Error (False Positive): Approving an applicant who defaults. Cost = 100% loss of unpaid principal minus collateral liquidation value.</w:t>
+        <w:t>• Type I Error (False Negative — Rejecting a Creditworthy Applicant):</w:t>
         <w:br/>
-        <w:t>Because Type II errors cause catastrophic capital destruction, FinFlow provides an adjustable Risk Cutoff Threshold slider in the UI, empowering financial officers to tighten approvals during macroeconomic recessions or expand lending during favorable credit cycles.</w:t>
+        <w:t xml:space="preserve">  Financial Impact: The bank forfeits the Net Interest Margin (typically 3–4% annual margin over the tenure). However, the principal is completely preserved.</w:t>
+        <w:br/>
+        <w:br/>
+        <w:t>• Type II Error (False Positive — Approving a Defaulter):</w:t>
+        <w:br/>
+        <w:t xml:space="preserve">  Financial Impact: Catastrophic capital loss. The bank loses up to 100% of the disbursed unpaid principal, necessitating costly legal proceedings and loan loss provisioning.</w:t>
+        <w:br/>
+        <w:br/>
+        <w:t>Because Type II errors cause devastating capital destruction, FinFlow prioritizes high precision (97.34%) and provides an adjustable Risk Cutoff Threshold slider (tau) in the user interface. Financial officers can elevate tau to 0.65 during economic downturns to preserve liquidity, or lower tau to 0.45 during expansionary cycles to capture market share.</w:t>
       </w:r>
     </w:p>
     <w:p>
       <w:pPr>
         <w:pStyle w:val="Heading1"/>
+        <w:keepNext/>
+        <w:spacing w:before="280" w:after="80"/>
       </w:pPr>
       <w:r>
-        <w:t>7. Conclusion &amp; Future Scope</w:t>
+        <w:rPr>
+          <w:color w:val="1E3A8A"/>
+          <w:sz w:val="28"/>
+        </w:rPr>
+        <w:t>8. Full-Stack Web Application Architecture</w:t>
       </w:r>
     </w:p>
     <w:p>
+      <w:pPr>
+        <w:spacing w:line="276" w:lineRule="auto"/>
+      </w:pPr>
       <w:r>
-        <w:t>Conclusion: The system delivers a fully functional, high-accuracy machine learning framework that automates loan underwriting, reduces processing time from days to seconds, and enforces rigorous collateral and debt checks.</w:t>
+        <w:t>The application is built using Streamlit and features six modular operational dashboards:</w:t>
+        <w:br/>
+        <w:t>1. Executive Dashboard: High-level KPI summary (Approval Rate, Approved Capital in ₹ Crores, CIBIL distributions, and collateral breakdown).</w:t>
+        <w:br/>
+        <w:t>2. Exploratory Data Analysis (EDA): Interactive multidimensional filtering by education, employment, and loan tenure, featuring correlation heatmaps and boxplots.</w:t>
+        <w:br/>
+        <w:t>3. Real-Time Underwriter: Instant single-applicant evaluator computing solvency ratios on the fly, rendering an animated probability gauge meter, and generating customized underwriting notes.</w:t>
+        <w:br/>
+        <w:t>4. Batch Loan Screening: Automated bulk CSV evaluation processing multiple applicants in milliseconds with risk-tier classification and CSV export.</w:t>
+        <w:br/>
+        <w:t>5. Model Performance Hub: Live benchmark leaderboard, interactive ROC curves, confusion matrix visualizer, and feature importance rankings.</w:t>
+        <w:br/>
+        <w:t>6. Project Academic Report: Embedded documentation, system architecture diagrams, and viva voce defense questions.</w:t>
+      </w:r>
+    </w:p>
+    <w:p>
+      <w:pPr>
+        <w:pStyle w:val="Heading1"/>
+        <w:keepNext/>
+        <w:spacing w:before="280" w:after="80"/>
+      </w:pPr>
+      <w:r>
+        <w:rPr>
+          <w:color w:val="1E3A8A"/>
+          <w:sz w:val="28"/>
+        </w:rPr>
+        <w:t>9. Conclusion &amp; Viva Voce Preparation Guide</w:t>
+      </w:r>
+    </w:p>
+    <w:p>
+      <w:pPr>
+        <w:spacing w:line="276" w:lineRule="auto"/>
+      </w:pPr>
+      <w:r>
+        <w:t>Conclusion: The FinFlow system successfully achieves all CIE-2 rubric objectives, achieving over 95% classification accuracy and 0.9948 ROC-AUC, reducing decision cycle time from multiple business days to under 2 seconds, and providing full regulatory explainability.</w:t>
         <w:br/>
         <w:br/>
-        <w:t>Future Scope:</w:t>
+        <w:t>Key Viva Voce Q&amp;A for Defense:</w:t>
         <w:br/>
-        <w:t>1. Integration of alternate data: GST invoicing, digital payment histories (UPI), and utility bills.</w:t>
         <w:br/>
-        <w:t>2. Explainable AI (XAI): SHAP/LIME value waterfall charts generating legally mandated adverse action notices.</w:t>
+        <w:t>Q1: Why is Machine Learning superior to standard banking IF-THEN rules?</w:t>
         <w:br/>
-        <w:t>3. Core Banking Integration: Deployment as microservice APIs for Finacle and Temenos core banking platforms.</w:t>
+        <w:t>Answer: Traditional rules use rigid 1-dimensional cutoffs (e.g. CIBIL &gt; 650) that reject creditworthy applicants who have high collateral backing. Machine learning discovers non-linear multivariate combinations between credit history, asset coverage, and debt capacity, maximizing loan volume safely.</w:t>
+        <w:br/>
+        <w:br/>
+        <w:t>Q2: Why is Precision prioritized over Recall in banking?</w:t>
+        <w:br/>
+        <w:t>Answer: A False Positive (approving someone who defaults) causes a catastrophic 100% loss of loan principal, whereas a False Negative only forfeits a 3–4% interest spread. High precision directly prevents institutional capital destruction.</w:t>
+        <w:br/>
+        <w:br/>
+        <w:t>Q3: What role does the Asset Coverage Ratio (ACR) play?</w:t>
+        <w:br/>
+        <w:t>Answer: Raw asset wealth alone does not indicate safety. An applicant with ₹1 Crore in assets seeking ₹5 Crores is dangerously under-collateralized (ACR = 0.2). ACR normalizes total pledged assets against requested debt to verify recovery prospects.</w:t>
       </w:r>
     </w:p>
     <w:sectPr>
-      <w:pgSz w:w="12240" w:h="15840"/>
+      <w:pgSz w:w="11909" w:h="16834"/>
       <w:pgMar w:top="1440" w:right="1440" w:bottom="1440" w:left="1440" w:header="720" w:footer="720" w:gutter="0"/>
       <w:cols w:space="720"/>
       <w:docGrid w:linePitch="360"/>

</xml_diff>